<commit_message>
--CapNhatNhe-- +Sua loi form word
</commit_message>
<xml_diff>
--- a/LAB_AT_OOSD/LAB05/word/PhamMinhGiang-12DHCNPM1-1250080044.docx
+++ b/LAB_AT_OOSD/LAB05/word/PhamMinhGiang-12DHCNPM1-1250080044.docx
@@ -2693,14 +2693,9 @@
     <w:p>
       <w:pPr>
         <w:sectPr>
-          <w:headerReference w:type="even" r:id="rId7"/>
-          <w:headerReference w:type="default" r:id="rId8"/>
-          <w:footerReference w:type="even" r:id="rId9"/>
-          <w:footerReference w:type="default" r:id="rId10"/>
-          <w:headerReference w:type="first" r:id="rId11"/>
-          <w:footerReference w:type="first" r:id="rId12"/>
-          <w:pgSz w:w="12240" w:h="15840"/>
-          <w:pgMar w:top="1134" w:right="1134" w:bottom="1134" w:left="1247" w:header="708" w:footer="708" w:gutter="0"/>
+          <w:footerReference w:type="default" r:id="rId36"/>
+          <w:pgSz w:w="11906" w:h="16838"/>
+          <w:pgMar w:top="850" w:right="1134" w:bottom="850" w:left="1247" w:header="708" w:footer="708" w:gutter="0"/>
           <w:cols w:space="720"/>
           <w:docGrid w:linePitch="360"/>
         </w:sectPr>
@@ -2708,16 +2703,16 @@
     </w:p>
     <w:p>
       <w:pPr>
+        <w:spacing w:before="0" w:after="0"/>
         <w:jc w:val="center"/>
       </w:pPr>
       <w:r>
         <w:rPr>
           <w:noProof/>
         </w:rPr>
-        <w:lastRenderedPageBreak/>
         <w:drawing>
           <wp:inline distT="0" distB="0" distL="0" distR="0" wp14:anchorId="61754D10" wp14:editId="6C1A4BC2">
-            <wp:extent cx="8820000" cy="5390000"/>
+            <wp:extent cx="4860000" cy="2970000"/>
             <wp:effectExtent l="0" t="0" r="0" b="0"/>
             <wp:docPr id="1" name="Picture 1"/>
             <wp:cNvGraphicFramePr>
@@ -2739,7 +2734,7 @@
                   <pic:spPr>
                     <a:xfrm>
                       <a:off x="0" y="0"/>
-                      <a:ext cx="8820000" cy="5390000"/>
+                      <a:ext cx="4860000" cy="2970000"/>
                     </a:xfrm>
                     <a:prstGeom prst="rect">
                       <a:avLst/>
@@ -2778,6 +2773,7 @@
     <w:p>
       <w:pPr>
         <w:sectPr>
+          <w:footerReference w:type="default" r:id="rId37"/>
           <w:pgSz w:w="16838" w:h="11906" w:orient="landscape"/>
           <w:pgMar w:top="850" w:right="964" w:bottom="850" w:left="964" w:header="708" w:footer="708" w:gutter="0"/>
           <w:cols w:space="720"/>
@@ -2787,6 +2783,7 @@
     </w:p>
     <w:p>
       <w:pPr>
+        <w:spacing w:before="0" w:after="0"/>
         <w:jc w:val="center"/>
       </w:pPr>
       <w:r>
@@ -2796,7 +2793,7 @@
         <w:lastRenderedPageBreak/>
         <w:drawing>
           <wp:inline distT="0" distB="0" distL="0" distR="0" wp14:anchorId="47D92F5D" wp14:editId="71FACD30">
-            <wp:extent cx="8820000" cy="5084471"/>
+            <wp:extent cx="5760000" cy="3320469"/>
             <wp:effectExtent l="0" t="0" r="0" b="0"/>
             <wp:docPr id="2" name="Picture 2"/>
             <wp:cNvGraphicFramePr>
@@ -2818,7 +2815,7 @@
                   <pic:spPr>
                     <a:xfrm>
                       <a:off x="0" y="0"/>
-                      <a:ext cx="8820000" cy="5084471"/>
+                      <a:ext cx="5760000" cy="3320469"/>
                     </a:xfrm>
                     <a:prstGeom prst="rect">
                       <a:avLst/>
@@ -2857,6 +2854,7 @@
     <w:p>
       <w:pPr>
         <w:sectPr>
+          <w:footerReference w:type="default" r:id="rId38"/>
           <w:pgSz w:w="16838" w:h="11906" w:orient="landscape"/>
           <w:pgMar w:top="850" w:right="964" w:bottom="850" w:left="964" w:header="708" w:footer="708" w:gutter="0"/>
           <w:cols w:space="720"/>
@@ -2866,30 +2864,26 @@
     </w:p>
     <w:p>
       <w:pPr>
+        <w:spacing w:before="0" w:after="0"/>
         <w:jc w:val="center"/>
       </w:pPr>
       <w:r>
-        <w:rPr>
-          <w:noProof/>
-        </w:rPr>
-        <w:lastRenderedPageBreak/>
         <w:drawing>
-          <wp:inline distT="0" distB="0" distL="0" distR="0" wp14:anchorId="3D9E9270" wp14:editId="0764B107">
-            <wp:extent cx="8820000" cy="5292000"/>
-            <wp:effectExtent l="0" t="0" r="0" b="0"/>
-            <wp:docPr id="3" name="Picture 3"/>
+          <wp:inline xmlns:a="http://schemas.openxmlformats.org/drawingml/2006/main" xmlns:pic="http://schemas.openxmlformats.org/drawingml/2006/picture">
+            <wp:extent cx="5760000" cy="3534545"/>
+            <wp:docPr id="1822009939" name="Picture 1822009939"/>
             <wp:cNvGraphicFramePr>
-              <a:graphicFrameLocks xmlns:a="http://schemas.openxmlformats.org/drawingml/2006/main" noChangeAspect="1"/>
+              <a:graphicFrameLocks noChangeAspect="1"/>
             </wp:cNvGraphicFramePr>
-            <a:graphic xmlns:a="http://schemas.openxmlformats.org/drawingml/2006/main">
+            <a:graphic>
               <a:graphicData uri="http://schemas.openxmlformats.org/drawingml/2006/picture">
-                <pic:pic xmlns:pic="http://schemas.openxmlformats.org/drawingml/2006/picture">
+                <pic:pic>
                   <pic:nvPicPr>
-                    <pic:cNvPr id="0" name="U3_UseCase_Flow.png"/>
+                    <pic:cNvPr id="0" name="image.png"/>
                     <pic:cNvPicPr/>
                   </pic:nvPicPr>
                   <pic:blipFill>
-                    <a:blip r:embed="rId15"/>
+                    <a:blip r:embed="rId34"/>
                     <a:stretch>
                       <a:fillRect/>
                     </a:stretch>
@@ -2897,11 +2891,9 @@
                   <pic:spPr>
                     <a:xfrm>
                       <a:off x="0" y="0"/>
-                      <a:ext cx="8820000" cy="5292000"/>
+                      <a:ext cx="5760000" cy="3534545"/>
                     </a:xfrm>
-                    <a:prstGeom prst="rect">
-                      <a:avLst/>
-                    </a:prstGeom>
+                    <a:prstGeom prst="rect"/>
                   </pic:spPr>
                 </pic:pic>
               </a:graphicData>
@@ -2936,6 +2928,7 @@
     <w:p>
       <w:pPr>
         <w:sectPr>
+          <w:footerReference w:type="default" r:id="rId39"/>
           <w:pgSz w:w="16838" w:h="11906" w:orient="landscape"/>
           <w:pgMar w:top="850" w:right="964" w:bottom="850" w:left="964" w:header="708" w:footer="708" w:gutter="0"/>
           <w:cols w:space="720"/>
@@ -2945,30 +2938,26 @@
     </w:p>
     <w:p>
       <w:pPr>
+        <w:spacing w:before="0" w:after="0"/>
         <w:jc w:val="center"/>
       </w:pPr>
       <w:r>
-        <w:rPr>
-          <w:noProof/>
-        </w:rPr>
-        <w:lastRenderedPageBreak/>
         <w:drawing>
-          <wp:inline distT="0" distB="0" distL="0" distR="0" wp14:anchorId="3CE800F5" wp14:editId="2B797F50">
-            <wp:extent cx="5400000" cy="6750000"/>
-            <wp:effectExtent l="0" t="0" r="0" b="0"/>
-            <wp:docPr id="4" name="Picture 4"/>
+          <wp:inline xmlns:a="http://schemas.openxmlformats.org/drawingml/2006/main" xmlns:pic="http://schemas.openxmlformats.org/drawingml/2006/picture">
+            <wp:extent cx="4500000" cy="5550000"/>
+            <wp:docPr id="1822009940" name="Picture 1822009940"/>
             <wp:cNvGraphicFramePr>
-              <a:graphicFrameLocks xmlns:a="http://schemas.openxmlformats.org/drawingml/2006/main" noChangeAspect="1"/>
+              <a:graphicFrameLocks noChangeAspect="1"/>
             </wp:cNvGraphicFramePr>
-            <a:graphic xmlns:a="http://schemas.openxmlformats.org/drawingml/2006/main">
+            <a:graphic>
               <a:graphicData uri="http://schemas.openxmlformats.org/drawingml/2006/picture">
-                <pic:pic xmlns:pic="http://schemas.openxmlformats.org/drawingml/2006/picture">
+                <pic:pic>
                   <pic:nvPicPr>
-                    <pic:cNvPr id="0" name="U4_Activity.png"/>
+                    <pic:cNvPr id="0" name="image.png"/>
                     <pic:cNvPicPr/>
                   </pic:nvPicPr>
                   <pic:blipFill>
-                    <a:blip r:embed="rId16"/>
+                    <a:blip r:embed="rId35"/>
                     <a:stretch>
                       <a:fillRect/>
                     </a:stretch>
@@ -2976,11 +2965,9 @@
                   <pic:spPr>
                     <a:xfrm>
                       <a:off x="0" y="0"/>
-                      <a:ext cx="5400000" cy="6750000"/>
+                      <a:ext cx="4500000" cy="5550000"/>
                     </a:xfrm>
-                    <a:prstGeom prst="rect">
-                      <a:avLst/>
-                    </a:prstGeom>
+                    <a:prstGeom prst="rect"/>
                   </pic:spPr>
                 </pic:pic>
               </a:graphicData>
@@ -3015,6 +3002,7 @@
     <w:p>
       <w:pPr>
         <w:sectPr>
+          <w:footerReference w:type="default" r:id="rId40"/>
           <w:pgSz w:w="11906" w:h="16838"/>
           <w:pgMar w:top="850" w:right="1134" w:bottom="850" w:left="1247" w:header="708" w:footer="708" w:gutter="0"/>
           <w:cols w:space="720"/>
@@ -3024,6 +3012,7 @@
     </w:p>
     <w:p>
       <w:pPr>
+        <w:spacing w:before="0" w:after="0"/>
         <w:jc w:val="center"/>
       </w:pPr>
       <w:r>
@@ -3033,7 +3022,7 @@
         <w:lastRenderedPageBreak/>
         <w:drawing>
           <wp:inline distT="0" distB="0" distL="0" distR="0" wp14:anchorId="6F15DE66" wp14:editId="3501F40E">
-            <wp:extent cx="8820000" cy="4669412"/>
+            <wp:extent cx="5760000" cy="3049411"/>
             <wp:effectExtent l="0" t="0" r="0" b="0"/>
             <wp:docPr id="5" name="Picture 5"/>
             <wp:cNvGraphicFramePr>
@@ -3055,7 +3044,7 @@
                   <pic:spPr>
                     <a:xfrm>
                       <a:off x="0" y="0"/>
-                      <a:ext cx="8820000" cy="4669412"/>
+                      <a:ext cx="5760000" cy="3049411"/>
                     </a:xfrm>
                     <a:prstGeom prst="rect">
                       <a:avLst/>
@@ -3114,6 +3103,7 @@
     <w:p>
       <w:pPr>
         <w:sectPr>
+          <w:footerReference w:type="default" r:id="rId41"/>
           <w:pgSz w:w="16838" w:h="11906" w:orient="landscape"/>
           <w:pgMar w:top="850" w:right="964" w:bottom="850" w:left="964" w:header="708" w:footer="708" w:gutter="0"/>
           <w:cols w:space="720"/>
@@ -3123,6 +3113,7 @@
     </w:p>
     <w:p>
       <w:pPr>
+        <w:spacing w:before="0" w:after="0"/>
         <w:jc w:val="center"/>
       </w:pPr>
       <w:r>
@@ -3132,7 +3123,7 @@
         <w:lastRenderedPageBreak/>
         <w:drawing>
           <wp:inline distT="0" distB="0" distL="0" distR="0" wp14:anchorId="26FC8073" wp14:editId="3FD87A91">
-            <wp:extent cx="7920000" cy="4840000"/>
+            <wp:extent cx="5760000" cy="3520000"/>
             <wp:effectExtent l="0" t="0" r="0" b="0"/>
             <wp:docPr id="6" name="Picture 6"/>
             <wp:cNvGraphicFramePr>
@@ -3154,7 +3145,7 @@
                   <pic:spPr>
                     <a:xfrm>
                       <a:off x="0" y="0"/>
-                      <a:ext cx="7920000" cy="4840000"/>
+                      <a:ext cx="5760000" cy="3520000"/>
                     </a:xfrm>
                     <a:prstGeom prst="rect">
                       <a:avLst/>
@@ -3291,6 +3282,7 @@
     </w:p>
     <w:p>
       <w:pPr>
+        <w:spacing w:before="0" w:after="0"/>
         <w:jc w:val="center"/>
       </w:pPr>
       <w:r>
@@ -3300,7 +3292,7 @@
         <w:lastRenderedPageBreak/>
         <w:drawing>
           <wp:inline distT="0" distB="0" distL="0" distR="0" wp14:anchorId="5A8785BB" wp14:editId="1C224D2C">
-            <wp:extent cx="5760000" cy="3240000"/>
+            <wp:extent cx="5400000" cy="3037500"/>
             <wp:effectExtent l="0" t="0" r="0" b="0"/>
             <wp:docPr id="1417275976" name="Picture 1417275976"/>
             <wp:cNvGraphicFramePr>
@@ -3322,7 +3314,7 @@
                   <pic:spPr>
                     <a:xfrm>
                       <a:off x="0" y="0"/>
-                      <a:ext cx="5760000" cy="3240000"/>
+                      <a:ext cx="5400000" cy="3037500"/>
                     </a:xfrm>
                     <a:prstGeom prst="rect">
                       <a:avLst/>
@@ -3370,6 +3362,7 @@
     </w:p>
     <w:p>
       <w:pPr>
+        <w:spacing w:before="0" w:after="0"/>
         <w:jc w:val="center"/>
       </w:pPr>
       <w:r>
@@ -3379,7 +3372,7 @@
         <w:lastRenderedPageBreak/>
         <w:drawing>
           <wp:inline distT="0" distB="0" distL="0" distR="0" wp14:anchorId="6AF75C96" wp14:editId="2EA7CAE6">
-            <wp:extent cx="5760000" cy="3240000"/>
+            <wp:extent cx="5400000" cy="3037500"/>
             <wp:effectExtent l="0" t="0" r="0" b="0"/>
             <wp:docPr id="1073444780" name="Picture 1073444780"/>
             <wp:cNvGraphicFramePr>
@@ -3401,7 +3394,7 @@
                   <pic:spPr>
                     <a:xfrm>
                       <a:off x="0" y="0"/>
-                      <a:ext cx="5760000" cy="3240000"/>
+                      <a:ext cx="5400000" cy="3037500"/>
                     </a:xfrm>
                     <a:prstGeom prst="rect">
                       <a:avLst/>
@@ -3449,6 +3442,7 @@
     </w:p>
     <w:p>
       <w:pPr>
+        <w:spacing w:before="0" w:after="0"/>
         <w:jc w:val="center"/>
       </w:pPr>
       <w:r>
@@ -3458,7 +3452,7 @@
         <w:lastRenderedPageBreak/>
         <w:drawing>
           <wp:inline distT="0" distB="0" distL="0" distR="0" wp14:anchorId="761F9C50" wp14:editId="35BCA332">
-            <wp:extent cx="5760000" cy="3240000"/>
+            <wp:extent cx="5400000" cy="3037500"/>
             <wp:effectExtent l="0" t="0" r="0" b="0"/>
             <wp:docPr id="922774103" name="Picture 922774103"/>
             <wp:cNvGraphicFramePr>
@@ -3480,7 +3474,7 @@
                   <pic:spPr>
                     <a:xfrm>
                       <a:off x="0" y="0"/>
-                      <a:ext cx="5760000" cy="3240000"/>
+                      <a:ext cx="5400000" cy="3037500"/>
                     </a:xfrm>
                     <a:prstGeom prst="rect">
                       <a:avLst/>
@@ -3528,6 +3522,7 @@
     </w:p>
     <w:p>
       <w:pPr>
+        <w:spacing w:before="0" w:after="0"/>
         <w:jc w:val="center"/>
       </w:pPr>
       <w:r>
@@ -3537,7 +3532,7 @@
         <w:lastRenderedPageBreak/>
         <w:drawing>
           <wp:inline distT="0" distB="0" distL="0" distR="0" wp14:anchorId="20CD9201" wp14:editId="0966E5DE">
-            <wp:extent cx="5760000" cy="3240000"/>
+            <wp:extent cx="5400000" cy="3037500"/>
             <wp:effectExtent l="0" t="0" r="0" b="0"/>
             <wp:docPr id="596266485" name="Picture 596266485"/>
             <wp:cNvGraphicFramePr>
@@ -3559,7 +3554,7 @@
                   <pic:spPr>
                     <a:xfrm>
                       <a:off x="0" y="0"/>
-                      <a:ext cx="5760000" cy="3240000"/>
+                      <a:ext cx="5400000" cy="3037500"/>
                     </a:xfrm>
                     <a:prstGeom prst="rect">
                       <a:avLst/>
@@ -3607,6 +3602,7 @@
     </w:p>
     <w:p>
       <w:pPr>
+        <w:spacing w:before="283" w:after="0"/>
         <w:jc w:val="center"/>
       </w:pPr>
       <w:r>
@@ -3616,7 +3612,7 @@
         <w:lastRenderedPageBreak/>
         <w:drawing>
           <wp:inline distT="0" distB="0" distL="0" distR="0" wp14:anchorId="4B8D1D49" wp14:editId="7FA956BA">
-            <wp:extent cx="5760000" cy="3240000"/>
+            <wp:extent cx="5040000" cy="2835000"/>
             <wp:effectExtent l="0" t="0" r="0" b="0"/>
             <wp:docPr id="1547987879" name="Picture 1547987879"/>
             <wp:cNvGraphicFramePr>
@@ -3638,7 +3634,7 @@
                   <pic:spPr>
                     <a:xfrm>
                       <a:off x="0" y="0"/>
-                      <a:ext cx="5760000" cy="3240000"/>
+                      <a:ext cx="5040000" cy="2835000"/>
                     </a:xfrm>
                     <a:prstGeom prst="rect">
                       <a:avLst/>
@@ -3686,6 +3682,7 @@
     </w:p>
     <w:p>
       <w:pPr>
+        <w:spacing w:before="0" w:after="0"/>
         <w:jc w:val="center"/>
       </w:pPr>
       <w:r>
@@ -3695,7 +3692,7 @@
         <w:lastRenderedPageBreak/>
         <w:drawing>
           <wp:inline distT="0" distB="0" distL="0" distR="0" wp14:anchorId="1E711C47" wp14:editId="74568943">
-            <wp:extent cx="5760000" cy="3240000"/>
+            <wp:extent cx="5400000" cy="3037500"/>
             <wp:effectExtent l="0" t="0" r="0" b="0"/>
             <wp:docPr id="1822009930" name="Picture 1822009930"/>
             <wp:cNvGraphicFramePr>
@@ -3717,7 +3714,7 @@
                   <pic:spPr>
                     <a:xfrm>
                       <a:off x="0" y="0"/>
-                      <a:ext cx="5760000" cy="3240000"/>
+                      <a:ext cx="5400000" cy="3037500"/>
                     </a:xfrm>
                     <a:prstGeom prst="rect">
                       <a:avLst/>
@@ -3765,6 +3762,7 @@
     </w:p>
     <w:p>
       <w:pPr>
+        <w:spacing w:before="0" w:after="0"/>
         <w:jc w:val="center"/>
       </w:pPr>
       <w:r>
@@ -3774,7 +3772,7 @@
         <w:lastRenderedPageBreak/>
         <w:drawing>
           <wp:inline distT="0" distB="0" distL="0" distR="0" wp14:anchorId="36DCB565" wp14:editId="4C27A674">
-            <wp:extent cx="5760000" cy="3240000"/>
+            <wp:extent cx="5400000" cy="3037500"/>
             <wp:effectExtent l="0" t="0" r="0" b="0"/>
             <wp:docPr id="7" name="Picture 7"/>
             <wp:cNvGraphicFramePr>
@@ -3796,7 +3794,7 @@
                   <pic:spPr>
                     <a:xfrm>
                       <a:off x="0" y="0"/>
-                      <a:ext cx="5760000" cy="3240000"/>
+                      <a:ext cx="5400000" cy="3037500"/>
                     </a:xfrm>
                     <a:prstGeom prst="rect">
                       <a:avLst/>
@@ -3844,6 +3842,7 @@
     </w:p>
     <w:p>
       <w:pPr>
+        <w:spacing w:before="0" w:after="0"/>
         <w:jc w:val="center"/>
       </w:pPr>
       <w:r>
@@ -3853,7 +3852,7 @@
         <w:lastRenderedPageBreak/>
         <w:drawing>
           <wp:inline distT="0" distB="0" distL="0" distR="0" wp14:anchorId="282983EA" wp14:editId="5BB65E54">
-            <wp:extent cx="5760000" cy="3240000"/>
+            <wp:extent cx="5400000" cy="3037500"/>
             <wp:effectExtent l="0" t="0" r="0" b="0"/>
             <wp:docPr id="8" name="Picture 8"/>
             <wp:cNvGraphicFramePr>
@@ -3875,7 +3874,7 @@
                   <pic:spPr>
                     <a:xfrm>
                       <a:off x="0" y="0"/>
-                      <a:ext cx="5760000" cy="3240000"/>
+                      <a:ext cx="5400000" cy="3037500"/>
                     </a:xfrm>
                     <a:prstGeom prst="rect">
                       <a:avLst/>
@@ -3923,6 +3922,7 @@
     </w:p>
     <w:p>
       <w:pPr>
+        <w:spacing w:before="0" w:after="0"/>
         <w:jc w:val="center"/>
       </w:pPr>
       <w:r>
@@ -3932,7 +3932,7 @@
         <w:lastRenderedPageBreak/>
         <w:drawing>
           <wp:inline distT="0" distB="0" distL="0" distR="0" wp14:anchorId="7E4DB0CD" wp14:editId="0584A515">
-            <wp:extent cx="5760000" cy="3240000"/>
+            <wp:extent cx="5400000" cy="3037500"/>
             <wp:effectExtent l="0" t="0" r="0" b="0"/>
             <wp:docPr id="9" name="Picture 9"/>
             <wp:cNvGraphicFramePr>
@@ -3954,7 +3954,7 @@
                   <pic:spPr>
                     <a:xfrm>
                       <a:off x="0" y="0"/>
-                      <a:ext cx="5760000" cy="3240000"/>
+                      <a:ext cx="5400000" cy="3037500"/>
                     </a:xfrm>
                     <a:prstGeom prst="rect">
                       <a:avLst/>
@@ -8940,7 +8940,6 @@
         <w:spacing w:before="180" w:after="80"/>
       </w:pPr>
       <w:r>
-        <w:lastRenderedPageBreak/>
         <w:t>4.6. Artefact kiểm thử</w:t>
       </w:r>
     </w:p>
@@ -8994,32 +8993,9 @@
         <w:t>Kết luận: nhiệm vụ IV hoàn thành với kết quả thực thi đạt, có thể dùng tài liệu này làm phần kiểm thử và truy vết cho bài nộp.</w:t>
       </w:r>
     </w:p>
-    <w:p>
-      <w:pPr>
-        <w:tabs>
-          <w:tab w:val="left" w:pos="4707"/>
-        </w:tabs>
-        <w:sectPr>
-          <w:pgSz w:w="16838" w:h="11906" w:orient="landscape"/>
-          <w:pgMar w:top="850" w:right="964" w:bottom="850" w:left="964" w:header="708" w:footer="708" w:gutter="0"/>
-          <w:cols w:space="720"/>
-          <w:docGrid w:linePitch="360"/>
-        </w:sectPr>
-      </w:pPr>
-    </w:p>
-    <w:p>
-      <w:pPr>
-        <w:jc w:val="center"/>
-      </w:pPr>
-    </w:p>
-    <w:p>
-      <w:pPr>
-        <w:pStyle w:val="ListParagraph"/>
-        <w:spacing w:after="100" w:line="288" w:lineRule="auto"/>
-      </w:pPr>
-    </w:p>
     <w:sectPr>
       <w:footerReference w:type="default" r:id="rId29"/>
+      <w:type w:val="continuous"/>
       <w:pgSz w:w="12240" w:h="15840"/>
       <w:pgMar w:top="1134" w:right="1134" w:bottom="1134" w:left="1417" w:header="708" w:footer="708" w:gutter="0"/>
       <w:cols w:space="720"/>
@@ -9054,6 +9030,44 @@
     <w:pPr>
       <w:pStyle w:val="Footer"/>
     </w:pPr>
+  </w:p>
+</w:ftr>
+</file>
+
+<file path=word/footer10.xml><?xml version="1.0" encoding="utf-8"?>
+<w:ftr xmlns:m="http://schemas.openxmlformats.org/officeDocument/2006/math" xmlns:mc="http://schemas.openxmlformats.org/markup-compatibility/2006" xmlns:mo="http://schemas.microsoft.com/office/mac/office/2008/main" xmlns:mv="urn:schemas-microsoft-com:mac:vml" xmlns:o="urn:schemas-microsoft-com:office:office" xmlns:r="http://schemas.openxmlformats.org/officeDocument/2006/relationships" xmlns:v="urn:schemas-microsoft-com:vml" xmlns:w10="urn:schemas-microsoft-com:office:word" xmlns:w14="http://schemas.microsoft.com/office/word/2010/wordml" xmlns:w="http://schemas.openxmlformats.org/wordprocessingml/2006/main" xmlns:wne="http://schemas.microsoft.com/office/word/2006/wordml" xmlns:wp14="http://schemas.microsoft.com/office/word/2010/wordprocessingDrawing" xmlns:wp="http://schemas.openxmlformats.org/drawingml/2006/wordprocessingDrawing" xmlns:wpc="http://schemas.microsoft.com/office/word/2010/wordprocessingCanvas" xmlns:wpg="http://schemas.microsoft.com/office/word/2010/wordprocessingGroup" xmlns:wpi="http://schemas.microsoft.com/office/word/2010/wordprocessingInk" xmlns:wps="http://schemas.microsoft.com/office/word/2010/wordprocessingShape" mc:Ignorable="w14 wp14">
+  <w:p>
+    <w:pPr>
+      <w:pStyle w:val="Footer"/>
+      <w:jc w:val="right"/>
+      <w:pBdr>
+        <w:top w:val="single" w:sz="4" w:space="1" w:color="auto"/>
+      </w:pBdr>
+    </w:pPr>
+    <w:r>
+      <w:fldChar w:fldCharType="begin"/>
+      <w:instrText xml:space="preserve"> PAGE </w:instrText>
+      <w:fldChar w:fldCharType="end"/>
+    </w:r>
+  </w:p>
+</w:ftr>
+</file>
+
+<file path=word/footer11.xml><?xml version="1.0" encoding="utf-8"?>
+<w:ftr xmlns:m="http://schemas.openxmlformats.org/officeDocument/2006/math" xmlns:mc="http://schemas.openxmlformats.org/markup-compatibility/2006" xmlns:mo="http://schemas.microsoft.com/office/mac/office/2008/main" xmlns:mv="urn:schemas-microsoft-com:mac:vml" xmlns:o="urn:schemas-microsoft-com:office:office" xmlns:r="http://schemas.openxmlformats.org/officeDocument/2006/relationships" xmlns:v="urn:schemas-microsoft-com:vml" xmlns:w10="urn:schemas-microsoft-com:office:word" xmlns:w14="http://schemas.microsoft.com/office/word/2010/wordml" xmlns:w="http://schemas.openxmlformats.org/wordprocessingml/2006/main" xmlns:wne="http://schemas.microsoft.com/office/word/2006/wordml" xmlns:wp14="http://schemas.microsoft.com/office/word/2010/wordprocessingDrawing" xmlns:wp="http://schemas.openxmlformats.org/drawingml/2006/wordprocessingDrawing" xmlns:wpc="http://schemas.microsoft.com/office/word/2010/wordprocessingCanvas" xmlns:wpg="http://schemas.microsoft.com/office/word/2010/wordprocessingGroup" xmlns:wpi="http://schemas.microsoft.com/office/word/2010/wordprocessingInk" xmlns:wps="http://schemas.microsoft.com/office/word/2010/wordprocessingShape" mc:Ignorable="w14 wp14">
+  <w:p>
+    <w:pPr>
+      <w:pStyle w:val="Footer"/>
+      <w:jc w:val="right"/>
+      <w:pBdr>
+        <w:top w:val="single" w:sz="4" w:space="1" w:color="auto"/>
+      </w:pBdr>
+    </w:pPr>
+    <w:r>
+      <w:fldChar w:fldCharType="begin"/>
+      <w:instrText xml:space="preserve"> PAGE </w:instrText>
+      <w:fldChar w:fldCharType="end"/>
+    </w:r>
   </w:p>
 </w:ftr>
 </file>
@@ -9440,6 +9454,82 @@
     </w:r>
     <w:r>
       <w:t xml:space="preserve"> </w:t>
+    </w:r>
+  </w:p>
+</w:ftr>
+</file>
+
+<file path=word/footer6.xml><?xml version="1.0" encoding="utf-8"?>
+<w:ftr xmlns:m="http://schemas.openxmlformats.org/officeDocument/2006/math" xmlns:mc="http://schemas.openxmlformats.org/markup-compatibility/2006" xmlns:mo="http://schemas.microsoft.com/office/mac/office/2008/main" xmlns:mv="urn:schemas-microsoft-com:mac:vml" xmlns:o="urn:schemas-microsoft-com:office:office" xmlns:r="http://schemas.openxmlformats.org/officeDocument/2006/relationships" xmlns:v="urn:schemas-microsoft-com:vml" xmlns:w10="urn:schemas-microsoft-com:office:word" xmlns:w14="http://schemas.microsoft.com/office/word/2010/wordml" xmlns:w="http://schemas.openxmlformats.org/wordprocessingml/2006/main" xmlns:wne="http://schemas.microsoft.com/office/word/2006/wordml" xmlns:wp14="http://schemas.microsoft.com/office/word/2010/wordprocessingDrawing" xmlns:wp="http://schemas.openxmlformats.org/drawingml/2006/wordprocessingDrawing" xmlns:wpc="http://schemas.microsoft.com/office/word/2010/wordprocessingCanvas" xmlns:wpg="http://schemas.microsoft.com/office/word/2010/wordprocessingGroup" xmlns:wpi="http://schemas.microsoft.com/office/word/2010/wordprocessingInk" xmlns:wps="http://schemas.microsoft.com/office/word/2010/wordprocessingShape" mc:Ignorable="w14 wp14">
+  <w:p>
+    <w:pPr>
+      <w:pStyle w:val="Footer"/>
+      <w:jc w:val="right"/>
+      <w:pBdr>
+        <w:top w:val="single" w:sz="4" w:space="1" w:color="auto"/>
+      </w:pBdr>
+    </w:pPr>
+    <w:r>
+      <w:fldChar w:fldCharType="begin"/>
+      <w:instrText xml:space="preserve"> PAGE </w:instrText>
+      <w:fldChar w:fldCharType="end"/>
+    </w:r>
+  </w:p>
+</w:ftr>
+</file>
+
+<file path=word/footer7.xml><?xml version="1.0" encoding="utf-8"?>
+<w:ftr xmlns:m="http://schemas.openxmlformats.org/officeDocument/2006/math" xmlns:mc="http://schemas.openxmlformats.org/markup-compatibility/2006" xmlns:mo="http://schemas.microsoft.com/office/mac/office/2008/main" xmlns:mv="urn:schemas-microsoft-com:mac:vml" xmlns:o="urn:schemas-microsoft-com:office:office" xmlns:r="http://schemas.openxmlformats.org/officeDocument/2006/relationships" xmlns:v="urn:schemas-microsoft-com:vml" xmlns:w10="urn:schemas-microsoft-com:office:word" xmlns:w14="http://schemas.microsoft.com/office/word/2010/wordml" xmlns:w="http://schemas.openxmlformats.org/wordprocessingml/2006/main" xmlns:wne="http://schemas.microsoft.com/office/word/2006/wordml" xmlns:wp14="http://schemas.microsoft.com/office/word/2010/wordprocessingDrawing" xmlns:wp="http://schemas.openxmlformats.org/drawingml/2006/wordprocessingDrawing" xmlns:wpc="http://schemas.microsoft.com/office/word/2010/wordprocessingCanvas" xmlns:wpg="http://schemas.microsoft.com/office/word/2010/wordprocessingGroup" xmlns:wpi="http://schemas.microsoft.com/office/word/2010/wordprocessingInk" xmlns:wps="http://schemas.microsoft.com/office/word/2010/wordprocessingShape" mc:Ignorable="w14 wp14">
+  <w:p>
+    <w:pPr>
+      <w:pStyle w:val="Footer"/>
+      <w:jc w:val="right"/>
+      <w:pBdr>
+        <w:top w:val="single" w:sz="4" w:space="1" w:color="auto"/>
+      </w:pBdr>
+    </w:pPr>
+    <w:r>
+      <w:fldChar w:fldCharType="begin"/>
+      <w:instrText xml:space="preserve"> PAGE </w:instrText>
+      <w:fldChar w:fldCharType="end"/>
+    </w:r>
+  </w:p>
+</w:ftr>
+</file>
+
+<file path=word/footer8.xml><?xml version="1.0" encoding="utf-8"?>
+<w:ftr xmlns:m="http://schemas.openxmlformats.org/officeDocument/2006/math" xmlns:mc="http://schemas.openxmlformats.org/markup-compatibility/2006" xmlns:mo="http://schemas.microsoft.com/office/mac/office/2008/main" xmlns:mv="urn:schemas-microsoft-com:mac:vml" xmlns:o="urn:schemas-microsoft-com:office:office" xmlns:r="http://schemas.openxmlformats.org/officeDocument/2006/relationships" xmlns:v="urn:schemas-microsoft-com:vml" xmlns:w10="urn:schemas-microsoft-com:office:word" xmlns:w14="http://schemas.microsoft.com/office/word/2010/wordml" xmlns:w="http://schemas.openxmlformats.org/wordprocessingml/2006/main" xmlns:wne="http://schemas.microsoft.com/office/word/2006/wordml" xmlns:wp14="http://schemas.microsoft.com/office/word/2010/wordprocessingDrawing" xmlns:wp="http://schemas.openxmlformats.org/drawingml/2006/wordprocessingDrawing" xmlns:wpc="http://schemas.microsoft.com/office/word/2010/wordprocessingCanvas" xmlns:wpg="http://schemas.microsoft.com/office/word/2010/wordprocessingGroup" xmlns:wpi="http://schemas.microsoft.com/office/word/2010/wordprocessingInk" xmlns:wps="http://schemas.microsoft.com/office/word/2010/wordprocessingShape" mc:Ignorable="w14 wp14">
+  <w:p>
+    <w:pPr>
+      <w:pStyle w:val="Footer"/>
+      <w:jc w:val="right"/>
+      <w:pBdr>
+        <w:top w:val="single" w:sz="4" w:space="1" w:color="auto"/>
+      </w:pBdr>
+    </w:pPr>
+    <w:r>
+      <w:fldChar w:fldCharType="begin"/>
+      <w:instrText xml:space="preserve"> PAGE </w:instrText>
+      <w:fldChar w:fldCharType="end"/>
+    </w:r>
+  </w:p>
+</w:ftr>
+</file>
+
+<file path=word/footer9.xml><?xml version="1.0" encoding="utf-8"?>
+<w:ftr xmlns:m="http://schemas.openxmlformats.org/officeDocument/2006/math" xmlns:mc="http://schemas.openxmlformats.org/markup-compatibility/2006" xmlns:mo="http://schemas.microsoft.com/office/mac/office/2008/main" xmlns:mv="urn:schemas-microsoft-com:mac:vml" xmlns:o="urn:schemas-microsoft-com:office:office" xmlns:r="http://schemas.openxmlformats.org/officeDocument/2006/relationships" xmlns:v="urn:schemas-microsoft-com:vml" xmlns:w10="urn:schemas-microsoft-com:office:word" xmlns:w14="http://schemas.microsoft.com/office/word/2010/wordml" xmlns:w="http://schemas.openxmlformats.org/wordprocessingml/2006/main" xmlns:wne="http://schemas.microsoft.com/office/word/2006/wordml" xmlns:wp14="http://schemas.microsoft.com/office/word/2010/wordprocessingDrawing" xmlns:wp="http://schemas.openxmlformats.org/drawingml/2006/wordprocessingDrawing" xmlns:wpc="http://schemas.microsoft.com/office/word/2010/wordprocessingCanvas" xmlns:wpg="http://schemas.microsoft.com/office/word/2010/wordprocessingGroup" xmlns:wpi="http://schemas.microsoft.com/office/word/2010/wordprocessingInk" xmlns:wps="http://schemas.microsoft.com/office/word/2010/wordprocessingShape" mc:Ignorable="w14 wp14">
+  <w:p>
+    <w:pPr>
+      <w:pStyle w:val="Footer"/>
+      <w:jc w:val="right"/>
+      <w:pBdr>
+        <w:top w:val="single" w:sz="4" w:space="1" w:color="auto"/>
+      </w:pBdr>
+    </w:pPr>
+    <w:r>
+      <w:fldChar w:fldCharType="begin"/>
+      <w:instrText xml:space="preserve"> PAGE </w:instrText>
+      <w:fldChar w:fldCharType="end"/>
     </w:r>
   </w:p>
 </w:ftr>

</xml_diff>

<commit_message>
mục 3 - UML bằng draw.io   - Class Diagram thể hiện lớp, ID, quan hệ và bội số.   - Use Case Diagram tổng quát cho toàn hệ thống.   - Use Case Diagram chi tiết từ đăng ký khám đến xét nghiệm và nhận toa.   - Activity Diagram cho luồng chi tiết đó.   - Sequence Diagram “Lập toa thuốc”, theo Boundary - Control - Entity: Form/nhân viên hoặc bác sĩ → Service → các Entity/Db. - Chèn ảnh xuất từ sơ đồ vào Phần B của báo cáo cùng phần giải thích ngắn; giữ tệp `.drawio` gốc để chỉnh sửa.
</commit_message>
<xml_diff>
--- a/LAB_AT_OOSD/LAB05/word/PhamMinhGiang-12DHCNPM1-1250080044.docx
+++ b/LAB_AT_OOSD/LAB05/word/PhamMinhGiang-12DHCNPM1-1250080044.docx
@@ -8991,6 +8991,362 @@
           <w:color w:val="000000"/>
         </w:rPr>
         <w:t>Kết luận: nhiệm vụ IV hoàn thành với kết quả thực thi đạt, có thể dùng tài liệu này làm phần kiểm thử và truy vết cho bài nộp.</w:t>
+      </w:r>
+    </w:p>
+    <w:p>
+      <w:r>
+        <w:br w:type="page"/>
+      </w:r>
+    </w:p>
+    <w:p>
+      <w:pPr>
+        <w:pStyle w:val="Heading1"/>
+      </w:pPr>
+      <w:r>
+        <w:rPr>
+          <w:rFonts w:ascii="Times New Roman" w:hAnsi="Times New Roman"/>
+          <w:b/>
+          <w:sz w:val="26"/>
+        </w:rPr>
+        <w:t>B. MÔ HÌNH UML QUẢN LÝ HỒ SƠ BỆNH ÁN</w:t>
+      </w:r>
+    </w:p>
+    <w:p>
+      <w:pPr>
+        <w:ind w:firstLine="425"/>
+        <w:jc w:val="both"/>
+      </w:pPr>
+      <w:r>
+        <w:rPr>
+          <w:rFonts w:ascii="Times New Roman" w:hAnsi="Times New Roman"/>
+          <w:sz w:val="24"/>
+        </w:rPr>
+        <w:t>Các sơ đồ được tạo bằng draw.io, có thể chỉnh sửa từ các tệp nguồn .drawio trong thư mục LAB06\drawio. Hình dưới đây trình bày các mô hình phục vụ trả lời yêu cầu UML của bài.</w:t>
+      </w:r>
+    </w:p>
+    <w:p>
+      <w:pPr>
+        <w:pStyle w:val="Heading2"/>
+      </w:pPr>
+      <w:r>
+        <w:rPr>
+          <w:rFonts w:ascii="Times New Roman" w:hAnsi="Times New Roman"/>
+          <w:b/>
+          <w:sz w:val="24"/>
+        </w:rPr>
+        <w:t>1. Class Diagram</w:t>
+      </w:r>
+    </w:p>
+    <w:p>
+      <w:pPr>
+        <w:jc w:val="center"/>
+      </w:pPr>
+      <w:r>
+        <w:drawing>
+          <wp:inline xmlns:a="http://schemas.openxmlformats.org/drawingml/2006/main" xmlns:pic="http://schemas.openxmlformats.org/drawingml/2006/picture">
+            <wp:extent cx="5715000" cy="3571875"/>
+            <wp:docPr id="1822009941" name="Picture 1822009941"/>
+            <wp:cNvGraphicFramePr>
+              <a:graphicFrameLocks noChangeAspect="1"/>
+            </wp:cNvGraphicFramePr>
+            <a:graphic>
+              <a:graphicData uri="http://schemas.openxmlformats.org/drawingml/2006/picture">
+                <pic:pic>
+                  <pic:nvPicPr>
+                    <pic:cNvPr id="0" name="U1_ClassDiagram.png"/>
+                    <pic:cNvPicPr/>
+                  </pic:nvPicPr>
+                  <pic:blipFill>
+                    <a:blip r:embed="rId42"/>
+                    <a:stretch>
+                      <a:fillRect/>
+                    </a:stretch>
+                  </pic:blipFill>
+                  <pic:spPr>
+                    <a:xfrm>
+                      <a:off x="0" y="0"/>
+                      <a:ext cx="5715000" cy="3571875"/>
+                    </a:xfrm>
+                    <a:prstGeom prst="rect"/>
+                  </pic:spPr>
+                </pic:pic>
+              </a:graphicData>
+            </a:graphic>
+          </wp:inline>
+        </w:drawing>
+      </w:r>
+    </w:p>
+    <w:p>
+      <w:pPr>
+        <w:jc w:val="center"/>
+      </w:pPr>
+      <w:r>
+        <w:rPr>
+          <w:rFonts w:ascii="Times New Roman" w:hAnsi="Times New Roman"/>
+          <w:i/>
+          <w:sz w:val="20"/>
+        </w:rPr>
+        <w:t>Hình U1. Biểu đồ lớp với ID, thuộc tính, phương thức và bội số.</w:t>
+      </w:r>
+    </w:p>
+    <w:p>
+      <w:pPr>
+        <w:pStyle w:val="Heading2"/>
+      </w:pPr>
+      <w:r>
+        <w:rPr>
+          <w:rFonts w:ascii="Times New Roman" w:hAnsi="Times New Roman"/>
+          <w:b/>
+          <w:sz w:val="24"/>
+        </w:rPr>
+        <w:t>2. Use Case Diagram tổng quát</w:t>
+      </w:r>
+    </w:p>
+    <w:p>
+      <w:pPr>
+        <w:jc w:val="center"/>
+      </w:pPr>
+      <w:r>
+        <w:drawing>
+          <wp:inline xmlns:a="http://schemas.openxmlformats.org/drawingml/2006/main" xmlns:pic="http://schemas.openxmlformats.org/drawingml/2006/picture">
+            <wp:extent cx="5715000" cy="3571875"/>
+            <wp:docPr id="1822009942" name="Picture 1822009942"/>
+            <wp:cNvGraphicFramePr>
+              <a:graphicFrameLocks noChangeAspect="1"/>
+            </wp:cNvGraphicFramePr>
+            <a:graphic>
+              <a:graphicData uri="http://schemas.openxmlformats.org/drawingml/2006/picture">
+                <pic:pic>
+                  <pic:nvPicPr>
+                    <pic:cNvPr id="0" name="U2_UseCaseTongQuat.png"/>
+                    <pic:cNvPicPr/>
+                  </pic:nvPicPr>
+                  <pic:blipFill>
+                    <a:blip r:embed="rId43"/>
+                    <a:stretch>
+                      <a:fillRect/>
+                    </a:stretch>
+                  </pic:blipFill>
+                  <pic:spPr>
+                    <a:xfrm>
+                      <a:off x="0" y="0"/>
+                      <a:ext cx="5715000" cy="3571875"/>
+                    </a:xfrm>
+                    <a:prstGeom prst="rect"/>
+                  </pic:spPr>
+                </pic:pic>
+              </a:graphicData>
+            </a:graphic>
+          </wp:inline>
+        </w:drawing>
+      </w:r>
+    </w:p>
+    <w:p>
+      <w:pPr>
+        <w:jc w:val="center"/>
+      </w:pPr>
+      <w:r>
+        <w:rPr>
+          <w:rFonts w:ascii="Times New Roman" w:hAnsi="Times New Roman"/>
+          <w:i/>
+          <w:sz w:val="20"/>
+        </w:rPr>
+        <w:t>Hình U2. Use case tổng quát của toàn hệ thống.</w:t>
+      </w:r>
+    </w:p>
+    <w:p>
+      <w:pPr>
+        <w:pStyle w:val="Heading2"/>
+      </w:pPr>
+      <w:r>
+        <w:rPr>
+          <w:rFonts w:ascii="Times New Roman" w:hAnsi="Times New Roman"/>
+          <w:b/>
+          <w:sz w:val="24"/>
+        </w:rPr>
+        <w:t>3. Use Case Diagram chi tiết</w:t>
+      </w:r>
+    </w:p>
+    <w:p>
+      <w:pPr>
+        <w:jc w:val="center"/>
+      </w:pPr>
+      <w:r>
+        <w:drawing>
+          <wp:inline xmlns:a="http://schemas.openxmlformats.org/drawingml/2006/main" xmlns:pic="http://schemas.openxmlformats.org/drawingml/2006/picture">
+            <wp:extent cx="5715000" cy="3571875"/>
+            <wp:docPr id="1822009943" name="Picture 1822009943"/>
+            <wp:cNvGraphicFramePr>
+              <a:graphicFrameLocks noChangeAspect="1"/>
+            </wp:cNvGraphicFramePr>
+            <a:graphic>
+              <a:graphicData uri="http://schemas.openxmlformats.org/drawingml/2006/picture">
+                <pic:pic>
+                  <pic:nvPicPr>
+                    <pic:cNvPr id="0" name="U3_UseCaseChiTiet.png"/>
+                    <pic:cNvPicPr/>
+                  </pic:nvPicPr>
+                  <pic:blipFill>
+                    <a:blip r:embed="rId44"/>
+                    <a:stretch>
+                      <a:fillRect/>
+                    </a:stretch>
+                  </pic:blipFill>
+                  <pic:spPr>
+                    <a:xfrm>
+                      <a:off x="0" y="0"/>
+                      <a:ext cx="5715000" cy="3571875"/>
+                    </a:xfrm>
+                    <a:prstGeom prst="rect"/>
+                  </pic:spPr>
+                </pic:pic>
+              </a:graphicData>
+            </a:graphic>
+          </wp:inline>
+        </w:drawing>
+      </w:r>
+    </w:p>
+    <w:p>
+      <w:pPr>
+        <w:jc w:val="center"/>
+      </w:pPr>
+      <w:r>
+        <w:rPr>
+          <w:rFonts w:ascii="Times New Roman" w:hAnsi="Times New Roman"/>
+          <w:i/>
+          <w:sz w:val="20"/>
+        </w:rPr>
+        <w:t>Hình U3. Phân rã từ đăng ký khám đến nhận toa thuốc.</w:t>
+      </w:r>
+    </w:p>
+    <w:p>
+      <w:pPr>
+        <w:pStyle w:val="Heading2"/>
+      </w:pPr>
+      <w:r>
+        <w:rPr>
+          <w:rFonts w:ascii="Times New Roman" w:hAnsi="Times New Roman"/>
+          <w:b/>
+          <w:sz w:val="24"/>
+        </w:rPr>
+        <w:t>4. Activity Diagram</w:t>
+      </w:r>
+    </w:p>
+    <w:p>
+      <w:pPr>
+        <w:jc w:val="center"/>
+      </w:pPr>
+      <w:r>
+        <w:drawing>
+          <wp:inline xmlns:a="http://schemas.openxmlformats.org/drawingml/2006/main" xmlns:pic="http://schemas.openxmlformats.org/drawingml/2006/picture">
+            <wp:extent cx="5715000" cy="3571875"/>
+            <wp:docPr id="1822009944" name="Picture 1822009944"/>
+            <wp:cNvGraphicFramePr>
+              <a:graphicFrameLocks noChangeAspect="1"/>
+            </wp:cNvGraphicFramePr>
+            <a:graphic>
+              <a:graphicData uri="http://schemas.openxmlformats.org/drawingml/2006/picture">
+                <pic:pic>
+                  <pic:nvPicPr>
+                    <pic:cNvPr id="0" name="U4_ActivityDiagram.png"/>
+                    <pic:cNvPicPr/>
+                  </pic:nvPicPr>
+                  <pic:blipFill>
+                    <a:blip r:embed="rId45"/>
+                    <a:stretch>
+                      <a:fillRect/>
+                    </a:stretch>
+                  </pic:blipFill>
+                  <pic:spPr>
+                    <a:xfrm>
+                      <a:off x="0" y="0"/>
+                      <a:ext cx="5715000" cy="3571875"/>
+                    </a:xfrm>
+                    <a:prstGeom prst="rect"/>
+                  </pic:spPr>
+                </pic:pic>
+              </a:graphicData>
+            </a:graphic>
+          </wp:inline>
+        </w:drawing>
+      </w:r>
+    </w:p>
+    <w:p>
+      <w:pPr>
+        <w:jc w:val="center"/>
+      </w:pPr>
+      <w:r>
+        <w:rPr>
+          <w:rFonts w:ascii="Times New Roman" w:hAnsi="Times New Roman"/>
+          <w:i/>
+          <w:sz w:val="20"/>
+        </w:rPr>
+        <w:t>Hình U4. Luồng đăng ký khám, xét nghiệm và nhận toa.</w:t>
+      </w:r>
+    </w:p>
+    <w:p>
+      <w:pPr>
+        <w:pStyle w:val="Heading2"/>
+      </w:pPr>
+      <w:r>
+        <w:rPr>
+          <w:rFonts w:ascii="Times New Roman" w:hAnsi="Times New Roman"/>
+          <w:b/>
+          <w:sz w:val="24"/>
+        </w:rPr>
+        <w:t>5. Sequence Diagram lập toa thuốc</w:t>
+      </w:r>
+    </w:p>
+    <w:p>
+      <w:pPr>
+        <w:jc w:val="center"/>
+      </w:pPr>
+      <w:r>
+        <w:drawing>
+          <wp:inline xmlns:a="http://schemas.openxmlformats.org/drawingml/2006/main" xmlns:pic="http://schemas.openxmlformats.org/drawingml/2006/picture">
+            <wp:extent cx="5715000" cy="3571875"/>
+            <wp:docPr id="1822009945" name="Picture 1822009945"/>
+            <wp:cNvGraphicFramePr>
+              <a:graphicFrameLocks noChangeAspect="1"/>
+            </wp:cNvGraphicFramePr>
+            <a:graphic>
+              <a:graphicData uri="http://schemas.openxmlformats.org/drawingml/2006/picture">
+                <pic:pic>
+                  <pic:nvPicPr>
+                    <pic:cNvPr id="0" name="U5_SequenceLapToaThuoc.png"/>
+                    <pic:cNvPicPr/>
+                  </pic:nvPicPr>
+                  <pic:blipFill>
+                    <a:blip r:embed="rId46"/>
+                    <a:stretch>
+                      <a:fillRect/>
+                    </a:stretch>
+                  </pic:blipFill>
+                  <pic:spPr>
+                    <a:xfrm>
+                      <a:off x="0" y="0"/>
+                      <a:ext cx="5715000" cy="3571875"/>
+                    </a:xfrm>
+                    <a:prstGeom prst="rect"/>
+                  </pic:spPr>
+                </pic:pic>
+              </a:graphicData>
+            </a:graphic>
+          </wp:inline>
+        </w:drawing>
+      </w:r>
+    </w:p>
+    <w:p>
+      <w:pPr>
+        <w:jc w:val="center"/>
+      </w:pPr>
+      <w:r>
+        <w:rPr>
+          <w:rFonts w:ascii="Times New Roman" w:hAnsi="Times New Roman"/>
+          <w:i/>
+          <w:sz w:val="20"/>
+        </w:rPr>
+        <w:t>Hình U5. Tương tác Boundary - Control - Entity khi lập toa thuốc.</w:t>
       </w:r>
     </w:p>
     <w:sectPr>

</xml_diff>

<commit_message>
--CapNhatfileword-- ✓Tao database: - tạo database, bảng, khóa chính/ngoại, `UNIQUE`, `CHECK`, chỉ mục cần thiết và dữ liệu mẫu tối thiểu. - Chuyển các ID ở Hạng mục 2 thành khóa chính; áp dụng `UNIQUE` cho mã hồ sơ và các mã nghiệp vụ không được trùng. - Viết stored procedure hoặc service transaction cho các nghiệp vụ nhiều bảng:   - Đăng ký lần đầu + thu lệ phí năm + cấp hồ sơ.   - Lập phiếu khám + chỉ định xét nghiệm + lưu toa thuốc/chi tiết toa.   - Ghi nhận thanh toán viện phí + chuyển đợt điều trị sang hoàn tất. - Thêm báo cáo thiết kế CSDL vào Word: mô tả bảng, khóa, ràng buộc và transaction.
</commit_message>
<xml_diff>
--- a/LAB_AT_OOSD/LAB05/word/PhamMinhGiang-12DHCNPM1-1250080044.docx
+++ b/LAB_AT_OOSD/LAB05/word/PhamMinhGiang-12DHCNPM1-1250080044.docx
@@ -9347,6 +9347,2991 @@
           <w:sz w:val="20"/>
         </w:rPr>
         <w:t>Hình U5. Tương tác Boundary - Control - Entity khi lập toa thuốc.</w:t>
+      </w:r>
+    </w:p>
+    <w:p>
+      <w:r>
+        <w:br w:type="page"/>
+      </w:r>
+    </w:p>
+    <w:p>
+      <w:pPr>
+        <w:pStyle w:val="Heading1"/>
+        <w:spacing w:before="200" w:after="100"/>
+      </w:pPr>
+      <w:r>
+        <w:rPr>
+          <w:rFonts w:ascii="Times New Roman" w:hAnsi="Times New Roman"/>
+          <w:b/>
+          <w:sz w:val="26"/>
+        </w:rPr>
+        <w:t>C. THIẾT KẾ CƠ SỞ DỮ LIỆU SQL SERVER</w:t>
+      </w:r>
+    </w:p>
+    <w:p>
+      <w:pPr>
+        <w:spacing w:line="300" w:lineRule="auto" w:after="120"/>
+        <w:ind w:firstLine="425"/>
+        <w:jc w:val="both"/>
+      </w:pPr>
+      <w:r>
+        <w:rPr>
+          <w:rFonts w:ascii="Times New Roman" w:hAnsi="Times New Roman"/>
+          <w:sz w:val="24"/>
+        </w:rPr>
+        <w:t>Cơ sở dữ liệu QuanLyHoSoBenhAnDB được thiết kế từ các lớp và quan hệ ở phần phân tích. Script Database\QuanLyHoSoBenhAn.sql có thể chạy trên SQL Server hoặc LocalDB từ trạng thái chưa có database; script tạo schema, ràng buộc, chỉ mục, stored procedure và dữ liệu mẫu.</w:t>
+      </w:r>
+    </w:p>
+    <w:p>
+      <w:pPr>
+        <w:pStyle w:val="Heading1"/>
+        <w:spacing w:before="200" w:after="100"/>
+      </w:pPr>
+      <w:r>
+        <w:rPr>
+          <w:rFonts w:ascii="Times New Roman" w:hAnsi="Times New Roman"/>
+          <w:b/>
+          <w:sz w:val="26"/>
+        </w:rPr>
+        <w:t>1. DANH SÁCH BẢNG VÀ KHÓA</w:t>
+      </w:r>
+    </w:p>
+    <w:tbl>
+      <w:tblPr>
+        <w:tblW w:type="auto" w:w="0"/>
+        <w:jc w:val="center"/>
+        <w:tblLook w:firstColumn="1" w:firstRow="1" w:lastColumn="0" w:lastRow="0" w:noHBand="0" w:noVBand="1" w:val="04A0"/>
+        <w:tblBorders>
+          <w:top w:val="single" w:sz="6" w:color="BFBFBF"/>
+          <w:left w:val="single" w:sz="6" w:color="BFBFBF"/>
+          <w:bottom w:val="single" w:sz="6" w:color="BFBFBF"/>
+          <w:right w:val="single" w:sz="6" w:color="BFBFBF"/>
+          <w:insideH w:val="single" w:sz="6" w:color="BFBFBF"/>
+          <w:insideV w:val="single" w:sz="6" w:color="BFBFBF"/>
+        </w:tblBorders>
+      </w:tblPr>
+      <w:tblGrid>
+        <w:gridCol w:w="3230"/>
+        <w:gridCol w:w="3230"/>
+        <w:gridCol w:w="3230"/>
+      </w:tblGrid>
+      <w:tr>
+        <w:tc>
+          <w:tcPr>
+            <w:tcW w:type="dxa" w:w="1247"/>
+            <w:vAlign w:val="center"/>
+            <w:shd w:fill="D9EAF7"/>
+          </w:tcPr>
+          <w:p>
+            <w:pPr>
+              <w:spacing w:after="0"/>
+              <w:jc w:val="center"/>
+            </w:pPr>
+            <w:r/>
+            <w:r>
+              <w:rPr>
+                <w:rFonts w:ascii="Times New Roman" w:hAnsi="Times New Roman"/>
+                <w:b/>
+                <w:sz w:val="18"/>
+              </w:rPr>
+              <w:t>Nhóm</w:t>
+            </w:r>
+          </w:p>
+        </w:tc>
+        <w:tc>
+          <w:tcPr>
+            <w:tcW w:type="dxa" w:w="2494"/>
+            <w:vAlign w:val="center"/>
+            <w:shd w:fill="D9EAF7"/>
+          </w:tcPr>
+          <w:p>
+            <w:pPr>
+              <w:spacing w:after="0"/>
+              <w:jc w:val="center"/>
+            </w:pPr>
+            <w:r/>
+            <w:r>
+              <w:rPr>
+                <w:rFonts w:ascii="Times New Roman" w:hAnsi="Times New Roman"/>
+                <w:b/>
+                <w:sz w:val="18"/>
+              </w:rPr>
+              <w:t>Bảng</w:t>
+            </w:r>
+          </w:p>
+        </w:tc>
+        <w:tc>
+          <w:tcPr>
+            <w:tcW w:type="dxa" w:w="4876"/>
+            <w:vAlign w:val="center"/>
+            <w:shd w:fill="D9EAF7"/>
+          </w:tcPr>
+          <w:p>
+            <w:pPr>
+              <w:spacing w:after="0"/>
+              <w:jc w:val="center"/>
+            </w:pPr>
+            <w:r/>
+            <w:r>
+              <w:rPr>
+                <w:rFonts w:ascii="Times New Roman" w:hAnsi="Times New Roman"/>
+                <w:b/>
+                <w:sz w:val="18"/>
+              </w:rPr>
+              <w:t>Khóa chính / khóa ngoại / UNIQUE</w:t>
+            </w:r>
+          </w:p>
+        </w:tc>
+      </w:tr>
+      <w:tr>
+        <w:tc>
+          <w:tcPr>
+            <w:tcW w:type="dxa" w:w="1247"/>
+            <w:vAlign w:val="center"/>
+          </w:tcPr>
+          <w:p>
+            <w:pPr>
+              <w:spacing w:after="0"/>
+              <w:jc w:val="center"/>
+            </w:pPr>
+            <w:r/>
+            <w:r>
+              <w:rPr>
+                <w:rFonts w:ascii="Times New Roman" w:hAnsi="Times New Roman"/>
+                <w:b w:val="0"/>
+                <w:sz w:val="18"/>
+              </w:rPr>
+              <w:t>Hồ sơ</w:t>
+            </w:r>
+          </w:p>
+        </w:tc>
+        <w:tc>
+          <w:tcPr>
+            <w:tcW w:type="dxa" w:w="2494"/>
+            <w:vAlign w:val="center"/>
+          </w:tcPr>
+          <w:p>
+            <w:pPr>
+              <w:spacing w:after="0"/>
+              <w:jc w:val="left"/>
+            </w:pPr>
+            <w:r/>
+            <w:r>
+              <w:rPr>
+                <w:rFonts w:ascii="Times New Roman" w:hAnsi="Times New Roman"/>
+                <w:b w:val="0"/>
+                <w:sz w:val="18"/>
+              </w:rPr>
+              <w:t>BenhNhan</w:t>
+            </w:r>
+          </w:p>
+        </w:tc>
+        <w:tc>
+          <w:tcPr>
+            <w:tcW w:type="dxa" w:w="4876"/>
+            <w:vAlign w:val="center"/>
+          </w:tcPr>
+          <w:p>
+            <w:pPr>
+              <w:spacing w:after="0"/>
+              <w:jc w:val="left"/>
+            </w:pPr>
+            <w:r/>
+            <w:r>
+              <w:rPr>
+                <w:rFonts w:ascii="Times New Roman" w:hAnsi="Times New Roman"/>
+                <w:b w:val="0"/>
+                <w:sz w:val="18"/>
+              </w:rPr>
+              <w:t>PK MaBN; UNIQUE DienThoai</w:t>
+            </w:r>
+          </w:p>
+        </w:tc>
+      </w:tr>
+      <w:tr>
+        <w:tc>
+          <w:tcPr>
+            <w:tcW w:type="dxa" w:w="1247"/>
+            <w:vAlign w:val="center"/>
+          </w:tcPr>
+          <w:p>
+            <w:pPr>
+              <w:spacing w:after="0"/>
+              <w:jc w:val="center"/>
+            </w:pPr>
+            <w:r/>
+            <w:r>
+              <w:rPr>
+                <w:rFonts w:ascii="Times New Roman" w:hAnsi="Times New Roman"/>
+                <w:b w:val="0"/>
+                <w:sz w:val="18"/>
+              </w:rPr>
+              <w:t>Hồ sơ</w:t>
+            </w:r>
+          </w:p>
+        </w:tc>
+        <w:tc>
+          <w:tcPr>
+            <w:tcW w:type="dxa" w:w="2494"/>
+            <w:vAlign w:val="center"/>
+          </w:tcPr>
+          <w:p>
+            <w:pPr>
+              <w:spacing w:after="0"/>
+              <w:jc w:val="left"/>
+            </w:pPr>
+            <w:r/>
+            <w:r>
+              <w:rPr>
+                <w:rFonts w:ascii="Times New Roman" w:hAnsi="Times New Roman"/>
+                <w:b w:val="0"/>
+                <w:sz w:val="18"/>
+              </w:rPr>
+              <w:t>PhieuDangKy</w:t>
+            </w:r>
+          </w:p>
+        </w:tc>
+        <w:tc>
+          <w:tcPr>
+            <w:tcW w:type="dxa" w:w="4876"/>
+            <w:vAlign w:val="center"/>
+          </w:tcPr>
+          <w:p>
+            <w:pPr>
+              <w:spacing w:after="0"/>
+              <w:jc w:val="left"/>
+            </w:pPr>
+            <w:r/>
+            <w:r>
+              <w:rPr>
+                <w:rFonts w:ascii="Times New Roman" w:hAnsi="Times New Roman"/>
+                <w:b w:val="0"/>
+                <w:sz w:val="18"/>
+              </w:rPr>
+              <w:t>PK MaDK; FK MaBN</w:t>
+            </w:r>
+          </w:p>
+        </w:tc>
+      </w:tr>
+      <w:tr>
+        <w:tc>
+          <w:tcPr>
+            <w:tcW w:type="dxa" w:w="1247"/>
+            <w:vAlign w:val="center"/>
+          </w:tcPr>
+          <w:p>
+            <w:pPr>
+              <w:spacing w:after="0"/>
+              <w:jc w:val="center"/>
+            </w:pPr>
+            <w:r/>
+            <w:r>
+              <w:rPr>
+                <w:rFonts w:ascii="Times New Roman" w:hAnsi="Times New Roman"/>
+                <w:b w:val="0"/>
+                <w:sz w:val="18"/>
+              </w:rPr>
+              <w:t>Hồ sơ</w:t>
+            </w:r>
+          </w:p>
+        </w:tc>
+        <w:tc>
+          <w:tcPr>
+            <w:tcW w:type="dxa" w:w="2494"/>
+            <w:vAlign w:val="center"/>
+          </w:tcPr>
+          <w:p>
+            <w:pPr>
+              <w:spacing w:after="0"/>
+              <w:jc w:val="left"/>
+            </w:pPr>
+            <w:r/>
+            <w:r>
+              <w:rPr>
+                <w:rFonts w:ascii="Times New Roman" w:hAnsi="Times New Roman"/>
+                <w:b w:val="0"/>
+                <w:sz w:val="18"/>
+              </w:rPr>
+              <w:t>LePhiNam</w:t>
+            </w:r>
+          </w:p>
+        </w:tc>
+        <w:tc>
+          <w:tcPr>
+            <w:tcW w:type="dxa" w:w="4876"/>
+            <w:vAlign w:val="center"/>
+          </w:tcPr>
+          <w:p>
+            <w:pPr>
+              <w:spacing w:after="0"/>
+              <w:jc w:val="left"/>
+            </w:pPr>
+            <w:r/>
+            <w:r>
+              <w:rPr>
+                <w:rFonts w:ascii="Times New Roman" w:hAnsi="Times New Roman"/>
+                <w:b w:val="0"/>
+                <w:sz w:val="18"/>
+              </w:rPr>
+              <w:t>PK MaLePhi; FK MaBN; UNIQUE (MaBN, Nam)</w:t>
+            </w:r>
+          </w:p>
+        </w:tc>
+      </w:tr>
+      <w:tr>
+        <w:tc>
+          <w:tcPr>
+            <w:tcW w:type="dxa" w:w="1247"/>
+            <w:vAlign w:val="center"/>
+          </w:tcPr>
+          <w:p>
+            <w:pPr>
+              <w:spacing w:after="0"/>
+              <w:jc w:val="center"/>
+            </w:pPr>
+            <w:r/>
+            <w:r>
+              <w:rPr>
+                <w:rFonts w:ascii="Times New Roman" w:hAnsi="Times New Roman"/>
+                <w:b w:val="0"/>
+                <w:sz w:val="18"/>
+              </w:rPr>
+              <w:t>Hồ sơ</w:t>
+            </w:r>
+          </w:p>
+        </w:tc>
+        <w:tc>
+          <w:tcPr>
+            <w:tcW w:type="dxa" w:w="2494"/>
+            <w:vAlign w:val="center"/>
+          </w:tcPr>
+          <w:p>
+            <w:pPr>
+              <w:spacing w:after="0"/>
+              <w:jc w:val="left"/>
+            </w:pPr>
+            <w:r/>
+            <w:r>
+              <w:rPr>
+                <w:rFonts w:ascii="Times New Roman" w:hAnsi="Times New Roman"/>
+                <w:b w:val="0"/>
+                <w:sz w:val="18"/>
+              </w:rPr>
+              <w:t>HoSoBenhAn</w:t>
+            </w:r>
+          </w:p>
+        </w:tc>
+        <w:tc>
+          <w:tcPr>
+            <w:tcW w:type="dxa" w:w="4876"/>
+            <w:vAlign w:val="center"/>
+          </w:tcPr>
+          <w:p>
+            <w:pPr>
+              <w:spacing w:after="0"/>
+              <w:jc w:val="left"/>
+            </w:pPr>
+            <w:r/>
+            <w:r>
+              <w:rPr>
+                <w:rFonts w:ascii="Times New Roman" w:hAnsi="Times New Roman"/>
+                <w:b w:val="0"/>
+                <w:sz w:val="18"/>
+              </w:rPr>
+              <w:t>PK MaHoSo; FK/UNIQUE MaBN</w:t>
+            </w:r>
+          </w:p>
+        </w:tc>
+      </w:tr>
+      <w:tr>
+        <w:tc>
+          <w:tcPr>
+            <w:tcW w:type="dxa" w:w="1247"/>
+            <w:vAlign w:val="center"/>
+          </w:tcPr>
+          <w:p>
+            <w:pPr>
+              <w:spacing w:after="0"/>
+              <w:jc w:val="center"/>
+            </w:pPr>
+            <w:r/>
+            <w:r>
+              <w:rPr>
+                <w:rFonts w:ascii="Times New Roman" w:hAnsi="Times New Roman"/>
+                <w:b w:val="0"/>
+                <w:sz w:val="18"/>
+              </w:rPr>
+              <w:t>Danh mục</w:t>
+            </w:r>
+          </w:p>
+        </w:tc>
+        <w:tc>
+          <w:tcPr>
+            <w:tcW w:type="dxa" w:w="2494"/>
+            <w:vAlign w:val="center"/>
+          </w:tcPr>
+          <w:p>
+            <w:pPr>
+              <w:spacing w:after="0"/>
+              <w:jc w:val="left"/>
+            </w:pPr>
+            <w:r/>
+            <w:r>
+              <w:rPr>
+                <w:rFonts w:ascii="Times New Roman" w:hAnsi="Times New Roman"/>
+                <w:b w:val="0"/>
+                <w:sz w:val="18"/>
+              </w:rPr>
+              <w:t>Khoa</w:t>
+            </w:r>
+          </w:p>
+        </w:tc>
+        <w:tc>
+          <w:tcPr>
+            <w:tcW w:type="dxa" w:w="4876"/>
+            <w:vAlign w:val="center"/>
+          </w:tcPr>
+          <w:p>
+            <w:pPr>
+              <w:spacing w:after="0"/>
+              <w:jc w:val="left"/>
+            </w:pPr>
+            <w:r/>
+            <w:r>
+              <w:rPr>
+                <w:rFonts w:ascii="Times New Roman" w:hAnsi="Times New Roman"/>
+                <w:b w:val="0"/>
+                <w:sz w:val="18"/>
+              </w:rPr>
+              <w:t>PK MaKhoa; UNIQUE TenKhoa</w:t>
+            </w:r>
+          </w:p>
+        </w:tc>
+      </w:tr>
+      <w:tr>
+        <w:tc>
+          <w:tcPr>
+            <w:tcW w:type="dxa" w:w="1247"/>
+            <w:vAlign w:val="center"/>
+          </w:tcPr>
+          <w:p>
+            <w:pPr>
+              <w:spacing w:after="0"/>
+              <w:jc w:val="center"/>
+            </w:pPr>
+            <w:r/>
+            <w:r>
+              <w:rPr>
+                <w:rFonts w:ascii="Times New Roman" w:hAnsi="Times New Roman"/>
+                <w:b w:val="0"/>
+                <w:sz w:val="18"/>
+              </w:rPr>
+              <w:t>Danh mục</w:t>
+            </w:r>
+          </w:p>
+        </w:tc>
+        <w:tc>
+          <w:tcPr>
+            <w:tcW w:type="dxa" w:w="2494"/>
+            <w:vAlign w:val="center"/>
+          </w:tcPr>
+          <w:p>
+            <w:pPr>
+              <w:spacing w:after="0"/>
+              <w:jc w:val="left"/>
+            </w:pPr>
+            <w:r/>
+            <w:r>
+              <w:rPr>
+                <w:rFonts w:ascii="Times New Roman" w:hAnsi="Times New Roman"/>
+                <w:b w:val="0"/>
+                <w:sz w:val="18"/>
+              </w:rPr>
+              <w:t>BacSi</w:t>
+            </w:r>
+          </w:p>
+        </w:tc>
+        <w:tc>
+          <w:tcPr>
+            <w:tcW w:type="dxa" w:w="4876"/>
+            <w:vAlign w:val="center"/>
+          </w:tcPr>
+          <w:p>
+            <w:pPr>
+              <w:spacing w:after="0"/>
+              <w:jc w:val="left"/>
+            </w:pPr>
+            <w:r/>
+            <w:r>
+              <w:rPr>
+                <w:rFonts w:ascii="Times New Roman" w:hAnsi="Times New Roman"/>
+                <w:b w:val="0"/>
+                <w:sz w:val="18"/>
+              </w:rPr>
+              <w:t>PK MaBS; FK MaKhoa; UNIQUE DienThoai</w:t>
+            </w:r>
+          </w:p>
+        </w:tc>
+      </w:tr>
+      <w:tr>
+        <w:tc>
+          <w:tcPr>
+            <w:tcW w:type="dxa" w:w="1247"/>
+            <w:vAlign w:val="center"/>
+          </w:tcPr>
+          <w:p>
+            <w:pPr>
+              <w:spacing w:after="0"/>
+              <w:jc w:val="center"/>
+            </w:pPr>
+            <w:r/>
+            <w:r>
+              <w:rPr>
+                <w:rFonts w:ascii="Times New Roman" w:hAnsi="Times New Roman"/>
+                <w:b w:val="0"/>
+                <w:sz w:val="18"/>
+              </w:rPr>
+              <w:t>Danh mục</w:t>
+            </w:r>
+          </w:p>
+        </w:tc>
+        <w:tc>
+          <w:tcPr>
+            <w:tcW w:type="dxa" w:w="2494"/>
+            <w:vAlign w:val="center"/>
+          </w:tcPr>
+          <w:p>
+            <w:pPr>
+              <w:spacing w:after="0"/>
+              <w:jc w:val="left"/>
+            </w:pPr>
+            <w:r/>
+            <w:r>
+              <w:rPr>
+                <w:rFonts w:ascii="Times New Roman" w:hAnsi="Times New Roman"/>
+                <w:b w:val="0"/>
+                <w:sz w:val="18"/>
+              </w:rPr>
+              <w:t>Thuoc</w:t>
+            </w:r>
+          </w:p>
+        </w:tc>
+        <w:tc>
+          <w:tcPr>
+            <w:tcW w:type="dxa" w:w="4876"/>
+            <w:vAlign w:val="center"/>
+          </w:tcPr>
+          <w:p>
+            <w:pPr>
+              <w:spacing w:after="0"/>
+              <w:jc w:val="left"/>
+            </w:pPr>
+            <w:r/>
+            <w:r>
+              <w:rPr>
+                <w:rFonts w:ascii="Times New Roman" w:hAnsi="Times New Roman"/>
+                <w:b w:val="0"/>
+                <w:sz w:val="18"/>
+              </w:rPr>
+              <w:t>PK MaThuoc; UNIQUE TenThuoc</w:t>
+            </w:r>
+          </w:p>
+        </w:tc>
+      </w:tr>
+      <w:tr>
+        <w:tc>
+          <w:tcPr>
+            <w:tcW w:type="dxa" w:w="1247"/>
+            <w:vAlign w:val="center"/>
+          </w:tcPr>
+          <w:p>
+            <w:pPr>
+              <w:spacing w:after="0"/>
+              <w:jc w:val="center"/>
+            </w:pPr>
+            <w:r/>
+            <w:r>
+              <w:rPr>
+                <w:rFonts w:ascii="Times New Roman" w:hAnsi="Times New Roman"/>
+                <w:b w:val="0"/>
+                <w:sz w:val="18"/>
+              </w:rPr>
+              <w:t>Điều trị</w:t>
+            </w:r>
+          </w:p>
+        </w:tc>
+        <w:tc>
+          <w:tcPr>
+            <w:tcW w:type="dxa" w:w="2494"/>
+            <w:vAlign w:val="center"/>
+          </w:tcPr>
+          <w:p>
+            <w:pPr>
+              <w:spacing w:after="0"/>
+              <w:jc w:val="left"/>
+            </w:pPr>
+            <w:r/>
+            <w:r>
+              <w:rPr>
+                <w:rFonts w:ascii="Times New Roman" w:hAnsi="Times New Roman"/>
+                <w:b w:val="0"/>
+                <w:sz w:val="18"/>
+              </w:rPr>
+              <w:t>PhieuKham</w:t>
+            </w:r>
+          </w:p>
+        </w:tc>
+        <w:tc>
+          <w:tcPr>
+            <w:tcW w:type="dxa" w:w="4876"/>
+            <w:vAlign w:val="center"/>
+          </w:tcPr>
+          <w:p>
+            <w:pPr>
+              <w:spacing w:after="0"/>
+              <w:jc w:val="left"/>
+            </w:pPr>
+            <w:r/>
+            <w:r>
+              <w:rPr>
+                <w:rFonts w:ascii="Times New Roman" w:hAnsi="Times New Roman"/>
+                <w:b w:val="0"/>
+                <w:sz w:val="18"/>
+              </w:rPr>
+              <w:t>PK MaPK; FK MaHoSo, MaBS, MaKhoa</w:t>
+            </w:r>
+          </w:p>
+        </w:tc>
+      </w:tr>
+      <w:tr>
+        <w:tc>
+          <w:tcPr>
+            <w:tcW w:type="dxa" w:w="1247"/>
+            <w:vAlign w:val="center"/>
+          </w:tcPr>
+          <w:p>
+            <w:pPr>
+              <w:spacing w:after="0"/>
+              <w:jc w:val="center"/>
+            </w:pPr>
+            <w:r/>
+            <w:r>
+              <w:rPr>
+                <w:rFonts w:ascii="Times New Roman" w:hAnsi="Times New Roman"/>
+                <w:b w:val="0"/>
+                <w:sz w:val="18"/>
+              </w:rPr>
+              <w:t>Điều trị</w:t>
+            </w:r>
+          </w:p>
+        </w:tc>
+        <w:tc>
+          <w:tcPr>
+            <w:tcW w:type="dxa" w:w="2494"/>
+            <w:vAlign w:val="center"/>
+          </w:tcPr>
+          <w:p>
+            <w:pPr>
+              <w:spacing w:after="0"/>
+              <w:jc w:val="left"/>
+            </w:pPr>
+            <w:r/>
+            <w:r>
+              <w:rPr>
+                <w:rFonts w:ascii="Times New Roman" w:hAnsi="Times New Roman"/>
+                <w:b w:val="0"/>
+                <w:sz w:val="18"/>
+              </w:rPr>
+              <w:t>ChiDinhXetNghiem</w:t>
+            </w:r>
+          </w:p>
+        </w:tc>
+        <w:tc>
+          <w:tcPr>
+            <w:tcW w:type="dxa" w:w="4876"/>
+            <w:vAlign w:val="center"/>
+          </w:tcPr>
+          <w:p>
+            <w:pPr>
+              <w:spacing w:after="0"/>
+              <w:jc w:val="left"/>
+            </w:pPr>
+            <w:r/>
+            <w:r>
+              <w:rPr>
+                <w:rFonts w:ascii="Times New Roman" w:hAnsi="Times New Roman"/>
+                <w:b w:val="0"/>
+                <w:sz w:val="18"/>
+              </w:rPr>
+              <w:t>PK MaCDXN; FK MaPK</w:t>
+            </w:r>
+          </w:p>
+        </w:tc>
+      </w:tr>
+      <w:tr>
+        <w:tc>
+          <w:tcPr>
+            <w:tcW w:type="dxa" w:w="1247"/>
+            <w:vAlign w:val="center"/>
+          </w:tcPr>
+          <w:p>
+            <w:pPr>
+              <w:spacing w:after="0"/>
+              <w:jc w:val="center"/>
+            </w:pPr>
+            <w:r/>
+            <w:r>
+              <w:rPr>
+                <w:rFonts w:ascii="Times New Roman" w:hAnsi="Times New Roman"/>
+                <w:b w:val="0"/>
+                <w:sz w:val="18"/>
+              </w:rPr>
+              <w:t>Điều trị</w:t>
+            </w:r>
+          </w:p>
+        </w:tc>
+        <w:tc>
+          <w:tcPr>
+            <w:tcW w:type="dxa" w:w="2494"/>
+            <w:vAlign w:val="center"/>
+          </w:tcPr>
+          <w:p>
+            <w:pPr>
+              <w:spacing w:after="0"/>
+              <w:jc w:val="left"/>
+            </w:pPr>
+            <w:r/>
+            <w:r>
+              <w:rPr>
+                <w:rFonts w:ascii="Times New Roman" w:hAnsi="Times New Roman"/>
+                <w:b w:val="0"/>
+                <w:sz w:val="18"/>
+              </w:rPr>
+              <w:t>KetQuaXetNghiem</w:t>
+            </w:r>
+          </w:p>
+        </w:tc>
+        <w:tc>
+          <w:tcPr>
+            <w:tcW w:type="dxa" w:w="4876"/>
+            <w:vAlign w:val="center"/>
+          </w:tcPr>
+          <w:p>
+            <w:pPr>
+              <w:spacing w:after="0"/>
+              <w:jc w:val="left"/>
+            </w:pPr>
+            <w:r/>
+            <w:r>
+              <w:rPr>
+                <w:rFonts w:ascii="Times New Roman" w:hAnsi="Times New Roman"/>
+                <w:b w:val="0"/>
+                <w:sz w:val="18"/>
+              </w:rPr>
+              <w:t>PK MaKQXN; FK/UNIQUE MaCDXN</w:t>
+            </w:r>
+          </w:p>
+        </w:tc>
+      </w:tr>
+      <w:tr>
+        <w:tc>
+          <w:tcPr>
+            <w:tcW w:type="dxa" w:w="1247"/>
+            <w:vAlign w:val="center"/>
+          </w:tcPr>
+          <w:p>
+            <w:pPr>
+              <w:spacing w:after="0"/>
+              <w:jc w:val="center"/>
+            </w:pPr>
+            <w:r/>
+            <w:r>
+              <w:rPr>
+                <w:rFonts w:ascii="Times New Roman" w:hAnsi="Times New Roman"/>
+                <w:b w:val="0"/>
+                <w:sz w:val="18"/>
+              </w:rPr>
+              <w:t>Điều trị</w:t>
+            </w:r>
+          </w:p>
+        </w:tc>
+        <w:tc>
+          <w:tcPr>
+            <w:tcW w:type="dxa" w:w="2494"/>
+            <w:vAlign w:val="center"/>
+          </w:tcPr>
+          <w:p>
+            <w:pPr>
+              <w:spacing w:after="0"/>
+              <w:jc w:val="left"/>
+            </w:pPr>
+            <w:r/>
+            <w:r>
+              <w:rPr>
+                <w:rFonts w:ascii="Times New Roman" w:hAnsi="Times New Roman"/>
+                <w:b w:val="0"/>
+                <w:sz w:val="18"/>
+              </w:rPr>
+              <w:t>ToaThuoc</w:t>
+            </w:r>
+          </w:p>
+        </w:tc>
+        <w:tc>
+          <w:tcPr>
+            <w:tcW w:type="dxa" w:w="4876"/>
+            <w:vAlign w:val="center"/>
+          </w:tcPr>
+          <w:p>
+            <w:pPr>
+              <w:spacing w:after="0"/>
+              <w:jc w:val="left"/>
+            </w:pPr>
+            <w:r/>
+            <w:r>
+              <w:rPr>
+                <w:rFonts w:ascii="Times New Roman" w:hAnsi="Times New Roman"/>
+                <w:b w:val="0"/>
+                <w:sz w:val="18"/>
+              </w:rPr>
+              <w:t>PK MaToa; FK/UNIQUE MaPK</w:t>
+            </w:r>
+          </w:p>
+        </w:tc>
+      </w:tr>
+      <w:tr>
+        <w:tc>
+          <w:tcPr>
+            <w:tcW w:type="dxa" w:w="1247"/>
+            <w:vAlign w:val="center"/>
+          </w:tcPr>
+          <w:p>
+            <w:pPr>
+              <w:spacing w:after="0"/>
+              <w:jc w:val="center"/>
+            </w:pPr>
+            <w:r/>
+            <w:r>
+              <w:rPr>
+                <w:rFonts w:ascii="Times New Roman" w:hAnsi="Times New Roman"/>
+                <w:b w:val="0"/>
+                <w:sz w:val="18"/>
+              </w:rPr>
+              <w:t>Điều trị</w:t>
+            </w:r>
+          </w:p>
+        </w:tc>
+        <w:tc>
+          <w:tcPr>
+            <w:tcW w:type="dxa" w:w="2494"/>
+            <w:vAlign w:val="center"/>
+          </w:tcPr>
+          <w:p>
+            <w:pPr>
+              <w:spacing w:after="0"/>
+              <w:jc w:val="left"/>
+            </w:pPr>
+            <w:r/>
+            <w:r>
+              <w:rPr>
+                <w:rFonts w:ascii="Times New Roman" w:hAnsi="Times New Roman"/>
+                <w:b w:val="0"/>
+                <w:sz w:val="18"/>
+              </w:rPr>
+              <w:t>ChiTietToaThuoc</w:t>
+            </w:r>
+          </w:p>
+        </w:tc>
+        <w:tc>
+          <w:tcPr>
+            <w:tcW w:type="dxa" w:w="4876"/>
+            <w:vAlign w:val="center"/>
+          </w:tcPr>
+          <w:p>
+            <w:pPr>
+              <w:spacing w:after="0"/>
+              <w:jc w:val="left"/>
+            </w:pPr>
+            <w:r/>
+            <w:r>
+              <w:rPr>
+                <w:rFonts w:ascii="Times New Roman" w:hAnsi="Times New Roman"/>
+                <w:b w:val="0"/>
+                <w:sz w:val="18"/>
+              </w:rPr>
+              <w:t>PK MaCTToa; FK MaToa, MaThuoc; UNIQUE (MaToa, MaThuoc)</w:t>
+            </w:r>
+          </w:p>
+        </w:tc>
+      </w:tr>
+      <w:tr>
+        <w:tc>
+          <w:tcPr>
+            <w:tcW w:type="dxa" w:w="1247"/>
+            <w:vAlign w:val="center"/>
+          </w:tcPr>
+          <w:p>
+            <w:pPr>
+              <w:spacing w:after="0"/>
+              <w:jc w:val="center"/>
+            </w:pPr>
+            <w:r/>
+            <w:r>
+              <w:rPr>
+                <w:rFonts w:ascii="Times New Roman" w:hAnsi="Times New Roman"/>
+                <w:b w:val="0"/>
+                <w:sz w:val="18"/>
+              </w:rPr>
+              <w:t>Theo dõi</w:t>
+            </w:r>
+          </w:p>
+        </w:tc>
+        <w:tc>
+          <w:tcPr>
+            <w:tcW w:type="dxa" w:w="2494"/>
+            <w:vAlign w:val="center"/>
+          </w:tcPr>
+          <w:p>
+            <w:pPr>
+              <w:spacing w:after="0"/>
+              <w:jc w:val="left"/>
+            </w:pPr>
+            <w:r/>
+            <w:r>
+              <w:rPr>
+                <w:rFonts w:ascii="Times New Roman" w:hAnsi="Times New Roman"/>
+                <w:b w:val="0"/>
+                <w:sz w:val="18"/>
+              </w:rPr>
+              <w:t>LichHen</w:t>
+            </w:r>
+          </w:p>
+        </w:tc>
+        <w:tc>
+          <w:tcPr>
+            <w:tcW w:type="dxa" w:w="4876"/>
+            <w:vAlign w:val="center"/>
+          </w:tcPr>
+          <w:p>
+            <w:pPr>
+              <w:spacing w:after="0"/>
+              <w:jc w:val="left"/>
+            </w:pPr>
+            <w:r/>
+            <w:r>
+              <w:rPr>
+                <w:rFonts w:ascii="Times New Roman" w:hAnsi="Times New Roman"/>
+                <w:b w:val="0"/>
+                <w:sz w:val="18"/>
+              </w:rPr>
+              <w:t>PK MaLichHen; FK MaHoSo; UNIQUE (MaHoSo, NgayGioHen)</w:t>
+            </w:r>
+          </w:p>
+        </w:tc>
+      </w:tr>
+      <w:tr>
+        <w:tc>
+          <w:tcPr>
+            <w:tcW w:type="dxa" w:w="1247"/>
+            <w:vAlign w:val="center"/>
+          </w:tcPr>
+          <w:p>
+            <w:pPr>
+              <w:spacing w:after="0"/>
+              <w:jc w:val="center"/>
+            </w:pPr>
+            <w:r/>
+            <w:r>
+              <w:rPr>
+                <w:rFonts w:ascii="Times New Roman" w:hAnsi="Times New Roman"/>
+                <w:b w:val="0"/>
+                <w:sz w:val="18"/>
+              </w:rPr>
+              <w:t>Thanh toán</w:t>
+            </w:r>
+          </w:p>
+        </w:tc>
+        <w:tc>
+          <w:tcPr>
+            <w:tcW w:type="dxa" w:w="2494"/>
+            <w:vAlign w:val="center"/>
+          </w:tcPr>
+          <w:p>
+            <w:pPr>
+              <w:spacing w:after="0"/>
+              <w:jc w:val="left"/>
+            </w:pPr>
+            <w:r/>
+            <w:r>
+              <w:rPr>
+                <w:rFonts w:ascii="Times New Roman" w:hAnsi="Times New Roman"/>
+                <w:b w:val="0"/>
+                <w:sz w:val="18"/>
+              </w:rPr>
+              <w:t>ThanhToanVienPhi</w:t>
+            </w:r>
+          </w:p>
+        </w:tc>
+        <w:tc>
+          <w:tcPr>
+            <w:tcW w:type="dxa" w:w="4876"/>
+            <w:vAlign w:val="center"/>
+          </w:tcPr>
+          <w:p>
+            <w:pPr>
+              <w:spacing w:after="0"/>
+              <w:jc w:val="left"/>
+            </w:pPr>
+            <w:r/>
+            <w:r>
+              <w:rPr>
+                <w:rFonts w:ascii="Times New Roman" w:hAnsi="Times New Roman"/>
+                <w:b w:val="0"/>
+                <w:sz w:val="18"/>
+              </w:rPr>
+              <w:t>PK MaTT; FK/UNIQUE MaPK</w:t>
+            </w:r>
+          </w:p>
+        </w:tc>
+      </w:tr>
+    </w:tbl>
+    <w:p/>
+    <w:p>
+      <w:pPr>
+        <w:pStyle w:val="Heading1"/>
+        <w:spacing w:before="200" w:after="100"/>
+      </w:pPr>
+      <w:r>
+        <w:rPr>
+          <w:rFonts w:ascii="Times New Roman" w:hAnsi="Times New Roman"/>
+          <w:b/>
+          <w:sz w:val="26"/>
+        </w:rPr>
+        <w:t>2. RÀNG BUỘC VÀ CHỈ MỤC</w:t>
+      </w:r>
+    </w:p>
+    <w:p>
+      <w:pPr>
+        <w:pStyle w:val="ListParagraph"/>
+        <w:ind w:left="397" w:hanging="198"/>
+      </w:pPr>
+      <w:r>
+        <w:rPr>
+          <w:rFonts w:ascii="Times New Roman" w:hAnsi="Times New Roman"/>
+          <w:sz w:val="24"/>
+        </w:rPr>
+        <w:t>• UNIQUE bảo đảm mã/định danh không trùng: số điện thoại bệnh nhân, hồ sơ theo bệnh nhân, lệ phí theo năm, toa theo phiếu khám, thanh toán theo phiếu khám và lịch hẹn theo thời điểm.</w:t>
+      </w:r>
+    </w:p>
+    <w:p>
+      <w:pPr>
+        <w:pStyle w:val="ListParagraph"/>
+        <w:ind w:left="397" w:hanging="198"/>
+      </w:pPr>
+      <w:r>
+        <w:rPr>
+          <w:rFonts w:ascii="Times New Roman" w:hAnsi="Times New Roman"/>
+          <w:sz w:val="24"/>
+        </w:rPr>
+        <w:t>• CHECK kiểm soát số tiền không âm/dương đúng quy tắc, năm hợp lệ, số lượng thuốc lớn hơn 0 và các trạng thái nghiệp vụ được phép.</w:t>
+      </w:r>
+    </w:p>
+    <w:p>
+      <w:pPr>
+        <w:pStyle w:val="ListParagraph"/>
+        <w:ind w:left="397" w:hanging="198"/>
+      </w:pPr>
+      <w:r>
+        <w:rPr>
+          <w:rFonts w:ascii="Times New Roman" w:hAnsi="Times New Roman"/>
+          <w:sz w:val="24"/>
+        </w:rPr>
+        <w:t>• Ba chỉ mục IX_PhieuKham_MaHoSo_Ngay, IX_ChiDinhXN_MaPK và IX_LichHen_MaHoSo_Ngay tối ưu tra cứu lịch sử, xét nghiệm và lịch hẹn.</w:t>
+      </w:r>
+    </w:p>
+    <w:p>
+      <w:pPr>
+        <w:pStyle w:val="Heading1"/>
+        <w:spacing w:before="200" w:after="100"/>
+      </w:pPr>
+      <w:r>
+        <w:rPr>
+          <w:rFonts w:ascii="Times New Roman" w:hAnsi="Times New Roman"/>
+          <w:b/>
+          <w:sz w:val="26"/>
+        </w:rPr>
+        <w:t>3. TRANSACTION NGHIỆP VỤ</w:t>
+      </w:r>
+    </w:p>
+    <w:tbl>
+      <w:tblPr>
+        <w:tblW w:type="auto" w:w="0"/>
+        <w:jc w:val="center"/>
+        <w:tblLook w:firstColumn="1" w:firstRow="1" w:lastColumn="0" w:lastRow="0" w:noHBand="0" w:noVBand="1" w:val="04A0"/>
+        <w:tblBorders>
+          <w:top w:val="single" w:sz="6" w:color="BFBFBF"/>
+          <w:left w:val="single" w:sz="6" w:color="BFBFBF"/>
+          <w:bottom w:val="single" w:sz="6" w:color="BFBFBF"/>
+          <w:right w:val="single" w:sz="6" w:color="BFBFBF"/>
+          <w:insideH w:val="single" w:sz="6" w:color="BFBFBF"/>
+          <w:insideV w:val="single" w:sz="6" w:color="BFBFBF"/>
+        </w:tblBorders>
+      </w:tblPr>
+      <w:tblGrid>
+        <w:gridCol w:w="3230"/>
+        <w:gridCol w:w="3230"/>
+        <w:gridCol w:w="3230"/>
+      </w:tblGrid>
+      <w:tr>
+        <w:tc>
+          <w:tcPr>
+            <w:tcW w:type="dxa" w:w="2494"/>
+            <w:vAlign w:val="center"/>
+            <w:shd w:fill="D9EAF7"/>
+          </w:tcPr>
+          <w:p>
+            <w:pPr>
+              <w:spacing w:after="0"/>
+              <w:jc w:val="center"/>
+            </w:pPr>
+            <w:r/>
+            <w:r>
+              <w:rPr>
+                <w:rFonts w:ascii="Times New Roman" w:hAnsi="Times New Roman"/>
+                <w:b/>
+                <w:sz w:val="18"/>
+              </w:rPr>
+              <w:t>Stored procedure</w:t>
+            </w:r>
+          </w:p>
+        </w:tc>
+        <w:tc>
+          <w:tcPr>
+            <w:tcW w:type="dxa" w:w="4195"/>
+            <w:vAlign w:val="center"/>
+            <w:shd w:fill="D9EAF7"/>
+          </w:tcPr>
+          <w:p>
+            <w:pPr>
+              <w:spacing w:after="0"/>
+              <w:jc w:val="center"/>
+            </w:pPr>
+            <w:r/>
+            <w:r>
+              <w:rPr>
+                <w:rFonts w:ascii="Times New Roman" w:hAnsi="Times New Roman"/>
+                <w:b/>
+                <w:sz w:val="18"/>
+              </w:rPr>
+              <w:t>Các bước trong transaction</w:t>
+            </w:r>
+          </w:p>
+        </w:tc>
+        <w:tc>
+          <w:tcPr>
+            <w:tcW w:type="dxa" w:w="1928"/>
+            <w:vAlign w:val="center"/>
+            <w:shd w:fill="D9EAF7"/>
+          </w:tcPr>
+          <w:p>
+            <w:pPr>
+              <w:spacing w:after="0"/>
+              <w:jc w:val="center"/>
+            </w:pPr>
+            <w:r/>
+            <w:r>
+              <w:rPr>
+                <w:rFonts w:ascii="Times New Roman" w:hAnsi="Times New Roman"/>
+                <w:b/>
+                <w:sz w:val="18"/>
+              </w:rPr>
+              <w:t>Quy tắc</w:t>
+            </w:r>
+          </w:p>
+        </w:tc>
+      </w:tr>
+      <w:tr>
+        <w:tc>
+          <w:tcPr>
+            <w:tcW w:type="dxa" w:w="2494"/>
+            <w:vAlign w:val="center"/>
+          </w:tcPr>
+          <w:p>
+            <w:pPr>
+              <w:spacing w:after="0"/>
+              <w:jc w:val="center"/>
+            </w:pPr>
+            <w:r/>
+            <w:r>
+              <w:rPr>
+                <w:rFonts w:ascii="Times New Roman" w:hAnsi="Times New Roman"/>
+                <w:b w:val="0"/>
+                <w:sz w:val="18"/>
+              </w:rPr>
+              <w:t>sp_DangKyCapHoSo</w:t>
+            </w:r>
+          </w:p>
+        </w:tc>
+        <w:tc>
+          <w:tcPr>
+            <w:tcW w:type="dxa" w:w="4195"/>
+            <w:vAlign w:val="center"/>
+          </w:tcPr>
+          <w:p>
+            <w:pPr>
+              <w:spacing w:after="0"/>
+              <w:jc w:val="left"/>
+            </w:pPr>
+            <w:r/>
+            <w:r>
+              <w:rPr>
+                <w:rFonts w:ascii="Times New Roman" w:hAnsi="Times New Roman"/>
+                <w:b w:val="0"/>
+                <w:sz w:val="18"/>
+              </w:rPr>
+              <w:t>Tạo/tìm bệnh nhân → tạo phiếu đăng ký → thu lệ phí năm → sinh mã hồ sơ.</w:t>
+            </w:r>
+          </w:p>
+        </w:tc>
+        <w:tc>
+          <w:tcPr>
+            <w:tcW w:type="dxa" w:w="1928"/>
+            <w:vAlign w:val="center"/>
+          </w:tcPr>
+          <w:p>
+            <w:pPr>
+              <w:spacing w:after="0"/>
+              <w:jc w:val="left"/>
+            </w:pPr>
+            <w:r/>
+            <w:r>
+              <w:rPr>
+                <w:rFonts w:ascii="Times New Roman" w:hAnsi="Times New Roman"/>
+                <w:b w:val="0"/>
+                <w:sz w:val="18"/>
+              </w:rPr>
+              <w:t>BR01, BR02; lỗi ở bất kỳ bước nào sẽ ROLLBACK.</w:t>
+            </w:r>
+          </w:p>
+        </w:tc>
+      </w:tr>
+      <w:tr>
+        <w:tc>
+          <w:tcPr>
+            <w:tcW w:type="dxa" w:w="2494"/>
+            <w:vAlign w:val="center"/>
+          </w:tcPr>
+          <w:p>
+            <w:pPr>
+              <w:spacing w:after="0"/>
+              <w:jc w:val="center"/>
+            </w:pPr>
+            <w:r/>
+            <w:r>
+              <w:rPr>
+                <w:rFonts w:ascii="Times New Roman" w:hAnsi="Times New Roman"/>
+                <w:b w:val="0"/>
+                <w:sz w:val="18"/>
+              </w:rPr>
+              <w:t>sp_LapPhieuKhamVaToa</w:t>
+            </w:r>
+          </w:p>
+        </w:tc>
+        <w:tc>
+          <w:tcPr>
+            <w:tcW w:type="dxa" w:w="4195"/>
+            <w:vAlign w:val="center"/>
+          </w:tcPr>
+          <w:p>
+            <w:pPr>
+              <w:spacing w:after="0"/>
+              <w:jc w:val="left"/>
+            </w:pPr>
+            <w:r/>
+            <w:r>
+              <w:rPr>
+                <w:rFonts w:ascii="Times New Roman" w:hAnsi="Times New Roman"/>
+                <w:b w:val="0"/>
+                <w:sz w:val="18"/>
+              </w:rPr>
+              <w:t>Kiểm tra hồ sơ → tạo phiếu khám → tùy chọn chỉ định xét nghiệm → tạo toa và chi tiết toa.</w:t>
+            </w:r>
+          </w:p>
+        </w:tc>
+        <w:tc>
+          <w:tcPr>
+            <w:tcW w:type="dxa" w:w="1928"/>
+            <w:vAlign w:val="center"/>
+          </w:tcPr>
+          <w:p>
+            <w:pPr>
+              <w:spacing w:after="0"/>
+              <w:jc w:val="left"/>
+            </w:pPr>
+            <w:r/>
+            <w:r>
+              <w:rPr>
+                <w:rFonts w:ascii="Times New Roman" w:hAnsi="Times New Roman"/>
+                <w:b w:val="0"/>
+                <w:sz w:val="18"/>
+              </w:rPr>
+              <w:t>BR03, BR04, BR05; toa phải có ít nhất một thuốc.</w:t>
+            </w:r>
+          </w:p>
+        </w:tc>
+      </w:tr>
+      <w:tr>
+        <w:tc>
+          <w:tcPr>
+            <w:tcW w:type="dxa" w:w="2494"/>
+            <w:vAlign w:val="center"/>
+          </w:tcPr>
+          <w:p>
+            <w:pPr>
+              <w:spacing w:after="0"/>
+              <w:jc w:val="center"/>
+            </w:pPr>
+            <w:r/>
+            <w:r>
+              <w:rPr>
+                <w:rFonts w:ascii="Times New Roman" w:hAnsi="Times New Roman"/>
+                <w:b w:val="0"/>
+                <w:sz w:val="18"/>
+              </w:rPr>
+              <w:t>sp_ThanhToanHoanTat</w:t>
+            </w:r>
+          </w:p>
+        </w:tc>
+        <w:tc>
+          <w:tcPr>
+            <w:tcW w:type="dxa" w:w="4195"/>
+            <w:vAlign w:val="center"/>
+          </w:tcPr>
+          <w:p>
+            <w:pPr>
+              <w:spacing w:after="0"/>
+              <w:jc w:val="left"/>
+            </w:pPr>
+            <w:r/>
+            <w:r>
+              <w:rPr>
+                <w:rFonts w:ascii="Times New Roman" w:hAnsi="Times New Roman"/>
+                <w:b w:val="0"/>
+                <w:sz w:val="18"/>
+              </w:rPr>
+              <w:t>Kiểm tra phiếu khám đang điều trị → tạo thanh toán → cập nhật phiếu khám hoàn tất.</w:t>
+            </w:r>
+          </w:p>
+        </w:tc>
+        <w:tc>
+          <w:tcPr>
+            <w:tcW w:type="dxa" w:w="1928"/>
+            <w:vAlign w:val="center"/>
+          </w:tcPr>
+          <w:p>
+            <w:pPr>
+              <w:spacing w:after="0"/>
+              <w:jc w:val="left"/>
+            </w:pPr>
+            <w:r/>
+            <w:r>
+              <w:rPr>
+                <w:rFonts w:ascii="Times New Roman" w:hAnsi="Times New Roman"/>
+                <w:b w:val="0"/>
+                <w:sz w:val="18"/>
+              </w:rPr>
+              <w:t>BR07; chặn thanh toán lặp hoặc hoàn tất khi chưa thanh toán.</w:t>
+            </w:r>
+          </w:p>
+        </w:tc>
+      </w:tr>
+    </w:tbl>
+    <w:p/>
+    <w:p>
+      <w:pPr>
+        <w:pStyle w:val="Heading1"/>
+        <w:spacing w:before="200" w:after="100"/>
+      </w:pPr>
+      <w:r>
+        <w:rPr>
+          <w:rFonts w:ascii="Times New Roman" w:hAnsi="Times New Roman"/>
+          <w:b/>
+          <w:sz w:val="26"/>
+        </w:rPr>
+        <w:t>4. KẾT QUẢ XÁC MINH</w:t>
+      </w:r>
+    </w:p>
+    <w:p>
+      <w:pPr>
+        <w:spacing w:line="300" w:lineRule="auto" w:after="120"/>
+        <w:ind w:firstLine="425"/>
+        <w:jc w:val="both"/>
+      </w:pPr>
+      <w:r>
+        <w:rPr>
+          <w:rFonts w:ascii="Times New Roman" w:hAnsi="Times New Roman"/>
+          <w:sz w:val="24"/>
+        </w:rPr>
+        <w:t>Script đã được chạy thành công trên SQL Server LocalDB (MSSQLLocalDB), tạo 14 bảng, 3 stored procedure và dữ liệu mẫu. Luồng kiểm thử thực tế đã thực hiện đăng ký/cấp hồ sơ, lập phiếu khám kèm toa và chỉ định xét nghiệm, sau đó thanh toán; phiếu khám nhận trạng thái Hoàn tất.</w:t>
+      </w:r>
+    </w:p>
+    <w:p>
+      <w:pPr>
+        <w:pStyle w:val="Heading1"/>
+        <w:spacing w:before="200" w:after="100"/>
+      </w:pPr>
+      <w:r>
+        <w:rPr>
+          <w:rFonts w:ascii="Times New Roman" w:hAnsi="Times New Roman"/>
+          <w:b/>
+          <w:sz w:val="26"/>
+        </w:rPr>
+        <w:t>5. LIÊN KẾT VỚI CÁC QUY TẮC NGHIỆP VỤ</w:t>
+      </w:r>
+    </w:p>
+    <w:tbl>
+      <w:tblPr>
+        <w:tblW w:type="auto" w:w="0"/>
+        <w:jc w:val="center"/>
+        <w:tblLook w:firstColumn="1" w:firstRow="1" w:lastColumn="0" w:lastRow="0" w:noHBand="0" w:noVBand="1" w:val="04A0"/>
+        <w:tblBorders>
+          <w:top w:val="single" w:sz="6" w:color="BFBFBF"/>
+          <w:left w:val="single" w:sz="6" w:color="BFBFBF"/>
+          <w:bottom w:val="single" w:sz="6" w:color="BFBFBF"/>
+          <w:right w:val="single" w:sz="6" w:color="BFBFBF"/>
+          <w:insideH w:val="single" w:sz="6" w:color="BFBFBF"/>
+          <w:insideV w:val="single" w:sz="6" w:color="BFBFBF"/>
+        </w:tblBorders>
+      </w:tblPr>
+      <w:tblGrid>
+        <w:gridCol w:w="4844"/>
+        <w:gridCol w:w="4844"/>
+      </w:tblGrid>
+      <w:tr>
+        <w:tc>
+          <w:tcPr>
+            <w:tcW w:type="dxa" w:w="1701"/>
+            <w:vAlign w:val="center"/>
+            <w:shd w:fill="D9EAF7"/>
+          </w:tcPr>
+          <w:p>
+            <w:pPr>
+              <w:spacing w:after="0"/>
+              <w:jc w:val="center"/>
+            </w:pPr>
+            <w:r/>
+            <w:r>
+              <w:rPr>
+                <w:rFonts w:ascii="Times New Roman" w:hAnsi="Times New Roman"/>
+                <w:b/>
+                <w:sz w:val="18"/>
+              </w:rPr>
+              <w:t>Quy tắc</w:t>
+            </w:r>
+          </w:p>
+        </w:tc>
+        <w:tc>
+          <w:tcPr>
+            <w:tcW w:type="dxa" w:w="6917"/>
+            <w:vAlign w:val="center"/>
+            <w:shd w:fill="D9EAF7"/>
+          </w:tcPr>
+          <w:p>
+            <w:pPr>
+              <w:spacing w:after="0"/>
+              <w:jc w:val="center"/>
+            </w:pPr>
+            <w:r/>
+            <w:r>
+              <w:rPr>
+                <w:rFonts w:ascii="Times New Roman" w:hAnsi="Times New Roman"/>
+                <w:b/>
+                <w:sz w:val="18"/>
+              </w:rPr>
+              <w:t>Hiện thực CSDL</w:t>
+            </w:r>
+          </w:p>
+        </w:tc>
+      </w:tr>
+      <w:tr>
+        <w:tc>
+          <w:tcPr>
+            <w:tcW w:type="dxa" w:w="1701"/>
+            <w:vAlign w:val="center"/>
+          </w:tcPr>
+          <w:p>
+            <w:pPr>
+              <w:spacing w:after="0"/>
+              <w:jc w:val="center"/>
+            </w:pPr>
+            <w:r/>
+            <w:r>
+              <w:rPr>
+                <w:rFonts w:ascii="Times New Roman" w:hAnsi="Times New Roman"/>
+                <w:b w:val="0"/>
+                <w:sz w:val="18"/>
+              </w:rPr>
+              <w:t>BR01-BR02</w:t>
+            </w:r>
+          </w:p>
+        </w:tc>
+        <w:tc>
+          <w:tcPr>
+            <w:tcW w:type="dxa" w:w="6917"/>
+            <w:vAlign w:val="center"/>
+          </w:tcPr>
+          <w:p>
+            <w:pPr>
+              <w:spacing w:after="0"/>
+              <w:jc w:val="left"/>
+            </w:pPr>
+            <w:r/>
+            <w:r>
+              <w:rPr>
+                <w:rFonts w:ascii="Times New Roman" w:hAnsi="Times New Roman"/>
+                <w:b w:val="0"/>
+                <w:sz w:val="18"/>
+              </w:rPr>
+              <w:t>sp_DangKyCapHoSo; UQ_HoSoBenhAn_MaBN; UQ_LePhiNam_BenhNhan_Nam</w:t>
+            </w:r>
+          </w:p>
+        </w:tc>
+      </w:tr>
+      <w:tr>
+        <w:tc>
+          <w:tcPr>
+            <w:tcW w:type="dxa" w:w="1701"/>
+            <w:vAlign w:val="center"/>
+          </w:tcPr>
+          <w:p>
+            <w:pPr>
+              <w:spacing w:after="0"/>
+              <w:jc w:val="center"/>
+            </w:pPr>
+            <w:r/>
+            <w:r>
+              <w:rPr>
+                <w:rFonts w:ascii="Times New Roman" w:hAnsi="Times New Roman"/>
+                <w:b w:val="0"/>
+                <w:sz w:val="18"/>
+              </w:rPr>
+              <w:t>BR03-BR05</w:t>
+            </w:r>
+          </w:p>
+        </w:tc>
+        <w:tc>
+          <w:tcPr>
+            <w:tcW w:type="dxa" w:w="6917"/>
+            <w:vAlign w:val="center"/>
+          </w:tcPr>
+          <w:p>
+            <w:pPr>
+              <w:spacing w:after="0"/>
+              <w:jc w:val="left"/>
+            </w:pPr>
+            <w:r/>
+            <w:r>
+              <w:rPr>
+                <w:rFonts w:ascii="Times New Roman" w:hAnsi="Times New Roman"/>
+                <w:b w:val="0"/>
+                <w:sz w:val="18"/>
+              </w:rPr>
+              <w:t>FK_PhieuKham; FK/UNIQUE cho xét nghiệm, toa và chi tiết toa; sp_LapPhieuKhamVaToa</w:t>
+            </w:r>
+          </w:p>
+        </w:tc>
+      </w:tr>
+      <w:tr>
+        <w:tc>
+          <w:tcPr>
+            <w:tcW w:type="dxa" w:w="1701"/>
+            <w:vAlign w:val="center"/>
+          </w:tcPr>
+          <w:p>
+            <w:pPr>
+              <w:spacing w:after="0"/>
+              <w:jc w:val="center"/>
+            </w:pPr>
+            <w:r/>
+            <w:r>
+              <w:rPr>
+                <w:rFonts w:ascii="Times New Roman" w:hAnsi="Times New Roman"/>
+                <w:b w:val="0"/>
+                <w:sz w:val="18"/>
+              </w:rPr>
+              <w:t>BR06</w:t>
+            </w:r>
+          </w:p>
+        </w:tc>
+        <w:tc>
+          <w:tcPr>
+            <w:tcW w:type="dxa" w:w="6917"/>
+            <w:vAlign w:val="center"/>
+          </w:tcPr>
+          <w:p>
+            <w:pPr>
+              <w:spacing w:after="0"/>
+              <w:jc w:val="left"/>
+            </w:pPr>
+            <w:r/>
+            <w:r>
+              <w:rPr>
+                <w:rFonts w:ascii="Times New Roman" w:hAnsi="Times New Roman"/>
+                <w:b w:val="0"/>
+                <w:sz w:val="18"/>
+              </w:rPr>
+              <w:t>Bảng LichHen với UNIQUE (MaHoSo, NgayGioHen) và LoaiHen Định kỳ/Tái khám</w:t>
+            </w:r>
+          </w:p>
+        </w:tc>
+      </w:tr>
+      <w:tr>
+        <w:tc>
+          <w:tcPr>
+            <w:tcW w:type="dxa" w:w="1701"/>
+            <w:vAlign w:val="center"/>
+          </w:tcPr>
+          <w:p>
+            <w:pPr>
+              <w:spacing w:after="0"/>
+              <w:jc w:val="center"/>
+            </w:pPr>
+            <w:r/>
+            <w:r>
+              <w:rPr>
+                <w:rFonts w:ascii="Times New Roman" w:hAnsi="Times New Roman"/>
+                <w:b w:val="0"/>
+                <w:sz w:val="18"/>
+              </w:rPr>
+              <w:t>BR07-BR08</w:t>
+            </w:r>
+          </w:p>
+        </w:tc>
+        <w:tc>
+          <w:tcPr>
+            <w:tcW w:type="dxa" w:w="6917"/>
+            <w:vAlign w:val="center"/>
+          </w:tcPr>
+          <w:p>
+            <w:pPr>
+              <w:spacing w:after="0"/>
+              <w:jc w:val="left"/>
+            </w:pPr>
+            <w:r/>
+            <w:r>
+              <w:rPr>
+                <w:rFonts w:ascii="Times New Roman" w:hAnsi="Times New Roman"/>
+                <w:b w:val="0"/>
+                <w:sz w:val="18"/>
+              </w:rPr>
+              <w:t>sp_ThanhToanHoanTat; TrangThai PhieuKham; chỉ mục lịch sử theo MaHoSo/Ngày</w:t>
+            </w:r>
+          </w:p>
+        </w:tc>
+      </w:tr>
+    </w:tbl>
+    <w:p/>
+    <w:p>
+      <w:r>
+        <w:br w:type="page"/>
+      </w:r>
+    </w:p>
+    <w:p>
+      <w:pPr>
+        <w:pStyle w:val="Heading1"/>
+        <w:spacing w:before="200"/>
+      </w:pPr>
+      <w:r>
+        <w:rPr>
+          <w:rFonts w:ascii="Times New Roman" w:hAnsi="Times New Roman"/>
+          <w:b/>
+          <w:sz w:val="26"/>
+        </w:rPr>
+        <w:t>D. THIẾT KẾ HỆ THỐNG WINFORMS</w:t>
+      </w:r>
+    </w:p>
+    <w:p>
+      <w:pPr>
+        <w:spacing w:line="300" w:lineRule="auto"/>
+        <w:ind w:firstLine="425"/>
+        <w:jc w:val="both"/>
+      </w:pPr>
+      <w:r>
+        <w:rPr>
+          <w:rFonts w:ascii="Times New Roman" w:hAnsi="Times New Roman"/>
+          <w:sz w:val="24"/>
+        </w:rPr>
+        <w:t>Ứng dụng QuanLyHoSoBenhAn được hiện thực bằng C# WinForms .NET Framework 4.7.2. Thiết kế ưu tiên phạm vi vừa đủ cho bài thực hành: giao diện thao tác trực tiếp, kiểm tra dữ liệu rõ ràng bằng tiếng Việt và thực hiện các nghiệp vụ nhiều bảng qua stored procedure đã xây dựng ở phần CSDL.</w:t>
+      </w:r>
+    </w:p>
+    <w:p>
+      <w:pPr>
+        <w:pStyle w:val="Heading1"/>
+        <w:spacing w:before="200"/>
+      </w:pPr>
+      <w:r>
+        <w:rPr>
+          <w:rFonts w:ascii="Times New Roman" w:hAnsi="Times New Roman"/>
+          <w:b/>
+          <w:sz w:val="26"/>
+        </w:rPr>
+        <w:t>1. KIẾN TRÚC VÀ CẤU HÌNH</w:t>
+      </w:r>
+    </w:p>
+    <w:tbl>
+      <w:tblPr>
+        <w:tblW w:type="auto" w:w="0"/>
+        <w:jc w:val="center"/>
+        <w:tblLook w:firstColumn="1" w:firstRow="1" w:lastColumn="0" w:lastRow="0" w:noHBand="0" w:noVBand="1" w:val="04A0"/>
+        <w:tblBorders>
+          <w:top w:val="single" w:sz="6" w:color="BFBFBF"/>
+          <w:left w:val="single" w:sz="6" w:color="BFBFBF"/>
+          <w:bottom w:val="single" w:sz="6" w:color="BFBFBF"/>
+          <w:right w:val="single" w:sz="6" w:color="BFBFBF"/>
+          <w:insideH w:val="single" w:sz="6" w:color="BFBFBF"/>
+          <w:insideV w:val="single" w:sz="6" w:color="BFBFBF"/>
+        </w:tblBorders>
+      </w:tblPr>
+      <w:tblGrid>
+        <w:gridCol w:w="3230"/>
+        <w:gridCol w:w="3230"/>
+        <w:gridCol w:w="3230"/>
+      </w:tblGrid>
+      <w:tr>
+        <w:tc>
+          <w:tcPr>
+            <w:tcW w:type="dxa" w:w="1417"/>
+            <w:vAlign w:val="center"/>
+            <w:shd w:fill="D9EAF7"/>
+          </w:tcPr>
+          <w:p>
+            <w:pPr>
+              <w:spacing w:after="0"/>
+              <w:jc w:val="center"/>
+            </w:pPr>
+            <w:r/>
+            <w:r>
+              <w:rPr>
+                <w:rFonts w:ascii="Times New Roman" w:hAnsi="Times New Roman"/>
+                <w:b/>
+                <w:sz w:val="19"/>
+              </w:rPr>
+              <w:t>Thành phần</w:t>
+            </w:r>
+          </w:p>
+        </w:tc>
+        <w:tc>
+          <w:tcPr>
+            <w:tcW w:type="dxa" w:w="4252"/>
+            <w:vAlign w:val="center"/>
+            <w:shd w:fill="D9EAF7"/>
+          </w:tcPr>
+          <w:p>
+            <w:pPr>
+              <w:spacing w:after="0"/>
+              <w:jc w:val="center"/>
+            </w:pPr>
+            <w:r/>
+            <w:r>
+              <w:rPr>
+                <w:rFonts w:ascii="Times New Roman" w:hAnsi="Times New Roman"/>
+                <w:b/>
+                <w:sz w:val="19"/>
+              </w:rPr>
+              <w:t>Vai trò</w:t>
+            </w:r>
+          </w:p>
+        </w:tc>
+        <w:tc>
+          <w:tcPr>
+            <w:tcW w:type="dxa" w:w="3572"/>
+            <w:vAlign w:val="center"/>
+            <w:shd w:fill="D9EAF7"/>
+          </w:tcPr>
+          <w:p>
+            <w:pPr>
+              <w:spacing w:after="0"/>
+              <w:jc w:val="center"/>
+            </w:pPr>
+            <w:r/>
+            <w:r>
+              <w:rPr>
+                <w:rFonts w:ascii="Times New Roman" w:hAnsi="Times New Roman"/>
+                <w:b/>
+                <w:sz w:val="19"/>
+              </w:rPr>
+              <w:t>Tệp/không gian tên</w:t>
+            </w:r>
+          </w:p>
+        </w:tc>
+      </w:tr>
+      <w:tr>
+        <w:tc>
+          <w:tcPr>
+            <w:tcW w:type="dxa" w:w="1417"/>
+            <w:vAlign w:val="center"/>
+          </w:tcPr>
+          <w:p>
+            <w:pPr>
+              <w:spacing w:after="0"/>
+              <w:jc w:val="center"/>
+            </w:pPr>
+            <w:r/>
+            <w:r>
+              <w:rPr>
+                <w:rFonts w:ascii="Times New Roman" w:hAnsi="Times New Roman"/>
+                <w:b w:val="0"/>
+                <w:sz w:val="19"/>
+              </w:rPr>
+              <w:t>Forms</w:t>
+            </w:r>
+          </w:p>
+        </w:tc>
+        <w:tc>
+          <w:tcPr>
+            <w:tcW w:type="dxa" w:w="4252"/>
+            <w:vAlign w:val="center"/>
+          </w:tcPr>
+          <w:p>
+            <w:pPr>
+              <w:spacing w:after="0"/>
+              <w:jc w:val="left"/>
+            </w:pPr>
+            <w:r/>
+            <w:r>
+              <w:rPr>
+                <w:rFonts w:ascii="Times New Roman" w:hAnsi="Times New Roman"/>
+                <w:b w:val="0"/>
+                <w:sz w:val="19"/>
+              </w:rPr>
+              <w:t>Hiển thị dữ liệu, nhận thao tác và thông báo kết quả; không chứa truy vấn SQL.</w:t>
+            </w:r>
+          </w:p>
+        </w:tc>
+        <w:tc>
+          <w:tcPr>
+            <w:tcW w:type="dxa" w:w="3572"/>
+            <w:vAlign w:val="center"/>
+          </w:tcPr>
+          <w:p>
+            <w:pPr>
+              <w:spacing w:after="0"/>
+              <w:jc w:val="left"/>
+            </w:pPr>
+            <w:r/>
+            <w:r>
+              <w:rPr>
+                <w:rFonts w:ascii="Times New Roman" w:hAnsi="Times New Roman"/>
+                <w:b w:val="0"/>
+                <w:sz w:val="19"/>
+              </w:rPr>
+              <w:t>Forms/FrmMain.cs</w:t>
+            </w:r>
+          </w:p>
+        </w:tc>
+      </w:tr>
+      <w:tr>
+        <w:tc>
+          <w:tcPr>
+            <w:tcW w:type="dxa" w:w="1417"/>
+            <w:vAlign w:val="center"/>
+          </w:tcPr>
+          <w:p>
+            <w:pPr>
+              <w:spacing w:after="0"/>
+              <w:jc w:val="center"/>
+            </w:pPr>
+            <w:r/>
+            <w:r>
+              <w:rPr>
+                <w:rFonts w:ascii="Times New Roman" w:hAnsi="Times New Roman"/>
+                <w:b w:val="0"/>
+                <w:sz w:val="19"/>
+              </w:rPr>
+              <w:t>Services</w:t>
+            </w:r>
+          </w:p>
+        </w:tc>
+        <w:tc>
+          <w:tcPr>
+            <w:tcW w:type="dxa" w:w="4252"/>
+            <w:vAlign w:val="center"/>
+          </w:tcPr>
+          <w:p>
+            <w:pPr>
+              <w:spacing w:after="0"/>
+              <w:jc w:val="left"/>
+            </w:pPr>
+            <w:r/>
+            <w:r>
+              <w:rPr>
+                <w:rFonts w:ascii="Times New Roman" w:hAnsi="Times New Roman"/>
+                <w:b w:val="0"/>
+                <w:sz w:val="19"/>
+              </w:rPr>
+              <w:t>Kiểm tra quy tắc, gọi stored procedure, tạo DataTable chi tiết toa và xử lý lỗi.</w:t>
+            </w:r>
+          </w:p>
+        </w:tc>
+        <w:tc>
+          <w:tcPr>
+            <w:tcW w:type="dxa" w:w="3572"/>
+            <w:vAlign w:val="center"/>
+          </w:tcPr>
+          <w:p>
+            <w:pPr>
+              <w:spacing w:after="0"/>
+              <w:jc w:val="left"/>
+            </w:pPr>
+            <w:r/>
+            <w:r>
+              <w:rPr>
+                <w:rFonts w:ascii="Times New Roman" w:hAnsi="Times New Roman"/>
+                <w:b w:val="0"/>
+                <w:sz w:val="19"/>
+              </w:rPr>
+              <w:t>Services/PatientService.cs; ClinicalService.cs</w:t>
+            </w:r>
+          </w:p>
+        </w:tc>
+      </w:tr>
+      <w:tr>
+        <w:tc>
+          <w:tcPr>
+            <w:tcW w:type="dxa" w:w="1417"/>
+            <w:vAlign w:val="center"/>
+          </w:tcPr>
+          <w:p>
+            <w:pPr>
+              <w:spacing w:after="0"/>
+              <w:jc w:val="center"/>
+            </w:pPr>
+            <w:r/>
+            <w:r>
+              <w:rPr>
+                <w:rFonts w:ascii="Times New Roman" w:hAnsi="Times New Roman"/>
+                <w:b w:val="0"/>
+                <w:sz w:val="19"/>
+              </w:rPr>
+              <w:t>Data</w:t>
+            </w:r>
+          </w:p>
+        </w:tc>
+        <w:tc>
+          <w:tcPr>
+            <w:tcW w:type="dxa" w:w="4252"/>
+            <w:vAlign w:val="center"/>
+          </w:tcPr>
+          <w:p>
+            <w:pPr>
+              <w:spacing w:after="0"/>
+              <w:jc w:val="left"/>
+            </w:pPr>
+            <w:r/>
+            <w:r>
+              <w:rPr>
+                <w:rFonts w:ascii="Times New Roman" w:hAnsi="Times New Roman"/>
+                <w:b w:val="0"/>
+                <w:sz w:val="19"/>
+              </w:rPr>
+              <w:t>Mở kết nối, chạy truy vấn tham số hóa và trả DataTable.</w:t>
+            </w:r>
+          </w:p>
+        </w:tc>
+        <w:tc>
+          <w:tcPr>
+            <w:tcW w:type="dxa" w:w="3572"/>
+            <w:vAlign w:val="center"/>
+          </w:tcPr>
+          <w:p>
+            <w:pPr>
+              <w:spacing w:after="0"/>
+              <w:jc w:val="left"/>
+            </w:pPr>
+            <w:r/>
+            <w:r>
+              <w:rPr>
+                <w:rFonts w:ascii="Times New Roman" w:hAnsi="Times New Roman"/>
+                <w:b w:val="0"/>
+                <w:sz w:val="19"/>
+              </w:rPr>
+              <w:t>Data/Db.cs</w:t>
+            </w:r>
+          </w:p>
+        </w:tc>
+      </w:tr>
+      <w:tr>
+        <w:tc>
+          <w:tcPr>
+            <w:tcW w:type="dxa" w:w="1417"/>
+            <w:vAlign w:val="center"/>
+          </w:tcPr>
+          <w:p>
+            <w:pPr>
+              <w:spacing w:after="0"/>
+              <w:jc w:val="center"/>
+            </w:pPr>
+            <w:r/>
+            <w:r>
+              <w:rPr>
+                <w:rFonts w:ascii="Times New Roman" w:hAnsi="Times New Roman"/>
+                <w:b w:val="0"/>
+                <w:sz w:val="19"/>
+              </w:rPr>
+              <w:t>Models</w:t>
+            </w:r>
+          </w:p>
+        </w:tc>
+        <w:tc>
+          <w:tcPr>
+            <w:tcW w:type="dxa" w:w="4252"/>
+            <w:vAlign w:val="center"/>
+          </w:tcPr>
+          <w:p>
+            <w:pPr>
+              <w:spacing w:after="0"/>
+              <w:jc w:val="left"/>
+            </w:pPr>
+            <w:r/>
+            <w:r>
+              <w:rPr>
+                <w:rFonts w:ascii="Times New Roman" w:hAnsi="Times New Roman"/>
+                <w:b w:val="0"/>
+                <w:sz w:val="19"/>
+              </w:rPr>
+              <w:t>Đóng gói dữ liệu đăng ký bệnh nhân.</w:t>
+            </w:r>
+          </w:p>
+        </w:tc>
+        <w:tc>
+          <w:tcPr>
+            <w:tcW w:type="dxa" w:w="3572"/>
+            <w:vAlign w:val="center"/>
+          </w:tcPr>
+          <w:p>
+            <w:pPr>
+              <w:spacing w:after="0"/>
+              <w:jc w:val="left"/>
+            </w:pPr>
+            <w:r/>
+            <w:r>
+              <w:rPr>
+                <w:rFonts w:ascii="Times New Roman" w:hAnsi="Times New Roman"/>
+                <w:b w:val="0"/>
+                <w:sz w:val="19"/>
+              </w:rPr>
+              <w:t>Models/PatientRegistration.cs</w:t>
+            </w:r>
+          </w:p>
+        </w:tc>
+      </w:tr>
+      <w:tr>
+        <w:tc>
+          <w:tcPr>
+            <w:tcW w:type="dxa" w:w="1417"/>
+            <w:vAlign w:val="center"/>
+          </w:tcPr>
+          <w:p>
+            <w:pPr>
+              <w:spacing w:after="0"/>
+              <w:jc w:val="center"/>
+            </w:pPr>
+            <w:r/>
+            <w:r>
+              <w:rPr>
+                <w:rFonts w:ascii="Times New Roman" w:hAnsi="Times New Roman"/>
+                <w:b w:val="0"/>
+                <w:sz w:val="19"/>
+              </w:rPr>
+              <w:t>Database</w:t>
+            </w:r>
+          </w:p>
+        </w:tc>
+        <w:tc>
+          <w:tcPr>
+            <w:tcW w:type="dxa" w:w="4252"/>
+            <w:vAlign w:val="center"/>
+          </w:tcPr>
+          <w:p>
+            <w:pPr>
+              <w:spacing w:after="0"/>
+              <w:jc w:val="left"/>
+            </w:pPr>
+            <w:r/>
+            <w:r>
+              <w:rPr>
+                <w:rFonts w:ascii="Times New Roman" w:hAnsi="Times New Roman"/>
+                <w:b w:val="0"/>
+                <w:sz w:val="19"/>
+              </w:rPr>
+              <w:t>Schema, ràng buộc, chỉ mục và stored procedure SQL Server.</w:t>
+            </w:r>
+          </w:p>
+        </w:tc>
+        <w:tc>
+          <w:tcPr>
+            <w:tcW w:type="dxa" w:w="3572"/>
+            <w:vAlign w:val="center"/>
+          </w:tcPr>
+          <w:p>
+            <w:pPr>
+              <w:spacing w:after="0"/>
+              <w:jc w:val="left"/>
+            </w:pPr>
+            <w:r/>
+            <w:r>
+              <w:rPr>
+                <w:rFonts w:ascii="Times New Roman" w:hAnsi="Times New Roman"/>
+                <w:b w:val="0"/>
+                <w:sz w:val="19"/>
+              </w:rPr>
+              <w:t>Database/QuanLyHoSoBenhAn.sql</w:t>
+            </w:r>
+          </w:p>
+        </w:tc>
+      </w:tr>
+      <w:tr>
+        <w:tc>
+          <w:tcPr>
+            <w:tcW w:type="dxa" w:w="1417"/>
+            <w:vAlign w:val="center"/>
+          </w:tcPr>
+          <w:p>
+            <w:pPr>
+              <w:spacing w:after="0"/>
+              <w:jc w:val="center"/>
+            </w:pPr>
+            <w:r/>
+            <w:r>
+              <w:rPr>
+                <w:rFonts w:ascii="Times New Roman" w:hAnsi="Times New Roman"/>
+                <w:b w:val="0"/>
+                <w:sz w:val="19"/>
+              </w:rPr>
+              <w:t>Configuration</w:t>
+            </w:r>
+          </w:p>
+        </w:tc>
+        <w:tc>
+          <w:tcPr>
+            <w:tcW w:type="dxa" w:w="4252"/>
+            <w:vAlign w:val="center"/>
+          </w:tcPr>
+          <w:p>
+            <w:pPr>
+              <w:spacing w:after="0"/>
+              <w:jc w:val="left"/>
+            </w:pPr>
+            <w:r/>
+            <w:r>
+              <w:rPr>
+                <w:rFonts w:ascii="Times New Roman" w:hAnsi="Times New Roman"/>
+                <w:b w:val="0"/>
+                <w:sz w:val="19"/>
+              </w:rPr>
+              <w:t>Chuỗi kết nối LocalDB có thể thay đổi theo SQL Server của máy sử dụng.</w:t>
+            </w:r>
+          </w:p>
+        </w:tc>
+        <w:tc>
+          <w:tcPr>
+            <w:tcW w:type="dxa" w:w="3572"/>
+            <w:vAlign w:val="center"/>
+          </w:tcPr>
+          <w:p>
+            <w:pPr>
+              <w:spacing w:after="0"/>
+              <w:jc w:val="left"/>
+            </w:pPr>
+            <w:r/>
+            <w:r>
+              <w:rPr>
+                <w:rFonts w:ascii="Times New Roman" w:hAnsi="Times New Roman"/>
+                <w:b w:val="0"/>
+                <w:sz w:val="19"/>
+              </w:rPr>
+              <w:t>App.config</w:t>
+            </w:r>
+          </w:p>
+        </w:tc>
+      </w:tr>
+    </w:tbl>
+    <w:p/>
+    <w:p>
+      <w:pPr>
+        <w:pStyle w:val="Heading1"/>
+        <w:spacing w:before="200"/>
+      </w:pPr>
+      <w:r>
+        <w:rPr>
+          <w:rFonts w:ascii="Times New Roman" w:hAnsi="Times New Roman"/>
+          <w:b/>
+          <w:sz w:val="26"/>
+        </w:rPr>
+        <w:t>2. CÁC MODULE GIAO DIỆN</w:t>
+      </w:r>
+    </w:p>
+    <w:tbl>
+      <w:tblPr>
+        <w:tblW w:type="auto" w:w="0"/>
+        <w:jc w:val="center"/>
+        <w:tblLook w:firstColumn="1" w:firstRow="1" w:lastColumn="0" w:lastRow="0" w:noHBand="0" w:noVBand="1" w:val="04A0"/>
+        <w:tblBorders>
+          <w:top w:val="single" w:sz="6" w:color="BFBFBF"/>
+          <w:left w:val="single" w:sz="6" w:color="BFBFBF"/>
+          <w:bottom w:val="single" w:sz="6" w:color="BFBFBF"/>
+          <w:right w:val="single" w:sz="6" w:color="BFBFBF"/>
+          <w:insideH w:val="single" w:sz="6" w:color="BFBFBF"/>
+          <w:insideV w:val="single" w:sz="6" w:color="BFBFBF"/>
+        </w:tblBorders>
+      </w:tblPr>
+      <w:tblGrid>
+        <w:gridCol w:w="3230"/>
+        <w:gridCol w:w="3230"/>
+        <w:gridCol w:w="3230"/>
+      </w:tblGrid>
+      <w:tr>
+        <w:tc>
+          <w:tcPr>
+            <w:tcW w:type="dxa" w:w="1814"/>
+            <w:vAlign w:val="center"/>
+            <w:shd w:fill="D9EAF7"/>
+          </w:tcPr>
+          <w:p>
+            <w:pPr>
+              <w:spacing w:after="0"/>
+              <w:jc w:val="center"/>
+            </w:pPr>
+            <w:r/>
+            <w:r>
+              <w:rPr>
+                <w:rFonts w:ascii="Times New Roman" w:hAnsi="Times New Roman"/>
+                <w:b/>
+                <w:sz w:val="19"/>
+              </w:rPr>
+              <w:t>Tab/Module</w:t>
+            </w:r>
+          </w:p>
+        </w:tc>
+        <w:tc>
+          <w:tcPr>
+            <w:tcW w:type="dxa" w:w="3231"/>
+            <w:vAlign w:val="center"/>
+            <w:shd w:fill="D9EAF7"/>
+          </w:tcPr>
+          <w:p>
+            <w:pPr>
+              <w:spacing w:after="0"/>
+              <w:jc w:val="center"/>
+            </w:pPr>
+            <w:r/>
+            <w:r>
+              <w:rPr>
+                <w:rFonts w:ascii="Times New Roman" w:hAnsi="Times New Roman"/>
+                <w:b/>
+                <w:sz w:val="19"/>
+              </w:rPr>
+              <w:t>Chức năng</w:t>
+            </w:r>
+          </w:p>
+        </w:tc>
+        <w:tc>
+          <w:tcPr>
+            <w:tcW w:type="dxa" w:w="4195"/>
+            <w:vAlign w:val="center"/>
+            <w:shd w:fill="D9EAF7"/>
+          </w:tcPr>
+          <w:p>
+            <w:pPr>
+              <w:spacing w:after="0"/>
+              <w:jc w:val="center"/>
+            </w:pPr>
+            <w:r/>
+            <w:r>
+              <w:rPr>
+                <w:rFonts w:ascii="Times New Roman" w:hAnsi="Times New Roman"/>
+                <w:b/>
+                <w:sz w:val="19"/>
+              </w:rPr>
+              <w:t>Nghiệp vụ/CSDL sử dụng</w:t>
+            </w:r>
+          </w:p>
+        </w:tc>
+      </w:tr>
+      <w:tr>
+        <w:tc>
+          <w:tcPr>
+            <w:tcW w:type="dxa" w:w="1814"/>
+            <w:vAlign w:val="center"/>
+          </w:tcPr>
+          <w:p>
+            <w:pPr>
+              <w:spacing w:after="0"/>
+              <w:jc w:val="center"/>
+            </w:pPr>
+            <w:r/>
+            <w:r>
+              <w:rPr>
+                <w:rFonts w:ascii="Times New Roman" w:hAnsi="Times New Roman"/>
+                <w:b w:val="0"/>
+                <w:sz w:val="19"/>
+              </w:rPr>
+              <w:t>Đăng ký - Hồ sơ</w:t>
+            </w:r>
+          </w:p>
+        </w:tc>
+        <w:tc>
+          <w:tcPr>
+            <w:tcW w:type="dxa" w:w="3231"/>
+            <w:vAlign w:val="center"/>
+          </w:tcPr>
+          <w:p>
+            <w:pPr>
+              <w:spacing w:after="0"/>
+              <w:jc w:val="left"/>
+            </w:pPr>
+            <w:r/>
+            <w:r>
+              <w:rPr>
+                <w:rFonts w:ascii="Times New Roman" w:hAnsi="Times New Roman"/>
+                <w:b w:val="0"/>
+                <w:sz w:val="19"/>
+              </w:rPr>
+              <w:t>Nhập bệnh nhân, lệ phí năm và cấp mã hồ sơ.</w:t>
+            </w:r>
+          </w:p>
+        </w:tc>
+        <w:tc>
+          <w:tcPr>
+            <w:tcW w:type="dxa" w:w="4195"/>
+            <w:vAlign w:val="center"/>
+          </w:tcPr>
+          <w:p>
+            <w:pPr>
+              <w:spacing w:after="0"/>
+              <w:jc w:val="left"/>
+            </w:pPr>
+            <w:r/>
+            <w:r>
+              <w:rPr>
+                <w:rFonts w:ascii="Times New Roman" w:hAnsi="Times New Roman"/>
+                <w:b w:val="0"/>
+                <w:sz w:val="19"/>
+              </w:rPr>
+              <w:t>PatientService.RegisterAndCreateRecord; sp_DangKyCapHoSo; BR01-BR02</w:t>
+            </w:r>
+          </w:p>
+        </w:tc>
+      </w:tr>
+      <w:tr>
+        <w:tc>
+          <w:tcPr>
+            <w:tcW w:type="dxa" w:w="1814"/>
+            <w:vAlign w:val="center"/>
+          </w:tcPr>
+          <w:p>
+            <w:pPr>
+              <w:spacing w:after="0"/>
+              <w:jc w:val="center"/>
+            </w:pPr>
+            <w:r/>
+            <w:r>
+              <w:rPr>
+                <w:rFonts w:ascii="Times New Roman" w:hAnsi="Times New Roman"/>
+                <w:b w:val="0"/>
+                <w:sz w:val="19"/>
+              </w:rPr>
+              <w:t>Tra cứu lịch sử</w:t>
+            </w:r>
+          </w:p>
+        </w:tc>
+        <w:tc>
+          <w:tcPr>
+            <w:tcW w:type="dxa" w:w="3231"/>
+            <w:vAlign w:val="center"/>
+          </w:tcPr>
+          <w:p>
+            <w:pPr>
+              <w:spacing w:after="0"/>
+              <w:jc w:val="left"/>
+            </w:pPr>
+            <w:r/>
+            <w:r>
+              <w:rPr>
+                <w:rFonts w:ascii="Times New Roman" w:hAnsi="Times New Roman"/>
+                <w:b w:val="0"/>
+                <w:sz w:val="19"/>
+              </w:rPr>
+              <w:t>Tìm theo mã hồ sơ, họ tên hoặc điện thoại; hiển thị phiếu khám, bác sĩ và khoa.</w:t>
+            </w:r>
+          </w:p>
+        </w:tc>
+        <w:tc>
+          <w:tcPr>
+            <w:tcW w:type="dxa" w:w="4195"/>
+            <w:vAlign w:val="center"/>
+          </w:tcPr>
+          <w:p>
+            <w:pPr>
+              <w:spacing w:after="0"/>
+              <w:jc w:val="left"/>
+            </w:pPr>
+            <w:r/>
+            <w:r>
+              <w:rPr>
+                <w:rFonts w:ascii="Times New Roman" w:hAnsi="Times New Roman"/>
+                <w:b w:val="0"/>
+                <w:sz w:val="19"/>
+              </w:rPr>
+              <w:t>PatientService.SearchHistory; chỉ mục lịch sử; BR08</w:t>
+            </w:r>
+          </w:p>
+        </w:tc>
+      </w:tr>
+      <w:tr>
+        <w:tc>
+          <w:tcPr>
+            <w:tcW w:type="dxa" w:w="1814"/>
+            <w:vAlign w:val="center"/>
+          </w:tcPr>
+          <w:p>
+            <w:pPr>
+              <w:spacing w:after="0"/>
+              <w:jc w:val="center"/>
+            </w:pPr>
+            <w:r/>
+            <w:r>
+              <w:rPr>
+                <w:rFonts w:ascii="Times New Roman" w:hAnsi="Times New Roman"/>
+                <w:b w:val="0"/>
+                <w:sz w:val="19"/>
+              </w:rPr>
+              <w:t>Lịch khám định kỳ</w:t>
+            </w:r>
+          </w:p>
+        </w:tc>
+        <w:tc>
+          <w:tcPr>
+            <w:tcW w:type="dxa" w:w="3231"/>
+            <w:vAlign w:val="center"/>
+          </w:tcPr>
+          <w:p>
+            <w:pPr>
+              <w:spacing w:after="0"/>
+              <w:jc w:val="left"/>
+            </w:pPr>
+            <w:r/>
+            <w:r>
+              <w:rPr>
+                <w:rFonts w:ascii="Times New Roman" w:hAnsi="Times New Roman"/>
+                <w:b w:val="0"/>
+                <w:sz w:val="19"/>
+              </w:rPr>
+              <w:t>Đặt lịch theo mã hồ sơ và ngày giờ hẹn.</w:t>
+            </w:r>
+          </w:p>
+        </w:tc>
+        <w:tc>
+          <w:tcPr>
+            <w:tcW w:type="dxa" w:w="4195"/>
+            <w:vAlign w:val="center"/>
+          </w:tcPr>
+          <w:p>
+            <w:pPr>
+              <w:spacing w:after="0"/>
+              <w:jc w:val="left"/>
+            </w:pPr>
+            <w:r/>
+            <w:r>
+              <w:rPr>
+                <w:rFonts w:ascii="Times New Roman" w:hAnsi="Times New Roman"/>
+                <w:b w:val="0"/>
+                <w:sz w:val="19"/>
+              </w:rPr>
+              <w:t>PatientService.CreateQuarterlyAppointment; bảng LichHen; BR06</w:t>
+            </w:r>
+          </w:p>
+        </w:tc>
+      </w:tr>
+      <w:tr>
+        <w:tc>
+          <w:tcPr>
+            <w:tcW w:type="dxa" w:w="1814"/>
+            <w:vAlign w:val="center"/>
+          </w:tcPr>
+          <w:p>
+            <w:pPr>
+              <w:spacing w:after="0"/>
+              <w:jc w:val="center"/>
+            </w:pPr>
+            <w:r/>
+            <w:r>
+              <w:rPr>
+                <w:rFonts w:ascii="Times New Roman" w:hAnsi="Times New Roman"/>
+                <w:b w:val="0"/>
+                <w:sz w:val="19"/>
+              </w:rPr>
+              <w:t>Khám - Xét nghiệm - Toa</w:t>
+            </w:r>
+          </w:p>
+        </w:tc>
+        <w:tc>
+          <w:tcPr>
+            <w:tcW w:type="dxa" w:w="3231"/>
+            <w:vAlign w:val="center"/>
+          </w:tcPr>
+          <w:p>
+            <w:pPr>
+              <w:spacing w:after="0"/>
+              <w:jc w:val="left"/>
+            </w:pPr>
+            <w:r/>
+            <w:r>
+              <w:rPr>
+                <w:rFonts w:ascii="Times New Roman" w:hAnsi="Times New Roman"/>
+                <w:b w:val="0"/>
+                <w:sz w:val="19"/>
+              </w:rPr>
+              <w:t>Lập phiếu khám, tùy chọn chỉ định xét nghiệm và toa thuốc có chi tiết.</w:t>
+            </w:r>
+          </w:p>
+        </w:tc>
+        <w:tc>
+          <w:tcPr>
+            <w:tcW w:type="dxa" w:w="4195"/>
+            <w:vAlign w:val="center"/>
+          </w:tcPr>
+          <w:p>
+            <w:pPr>
+              <w:spacing w:after="0"/>
+              <w:jc w:val="left"/>
+            </w:pPr>
+            <w:r/>
+            <w:r>
+              <w:rPr>
+                <w:rFonts w:ascii="Times New Roman" w:hAnsi="Times New Roman"/>
+                <w:b w:val="0"/>
+                <w:sz w:val="19"/>
+              </w:rPr>
+              <w:t>ClinicalService.CreateExaminationAndPrescription; sp_LapPhieuKhamVaToa; BR03-BR05</w:t>
+            </w:r>
+          </w:p>
+        </w:tc>
+      </w:tr>
+      <w:tr>
+        <w:tc>
+          <w:tcPr>
+            <w:tcW w:type="dxa" w:w="1814"/>
+            <w:vAlign w:val="center"/>
+          </w:tcPr>
+          <w:p>
+            <w:pPr>
+              <w:spacing w:after="0"/>
+              <w:jc w:val="center"/>
+            </w:pPr>
+            <w:r/>
+            <w:r>
+              <w:rPr>
+                <w:rFonts w:ascii="Times New Roman" w:hAnsi="Times New Roman"/>
+                <w:b w:val="0"/>
+                <w:sz w:val="19"/>
+              </w:rPr>
+              <w:t>Thanh toán - Hoàn tất</w:t>
+            </w:r>
+          </w:p>
+        </w:tc>
+        <w:tc>
+          <w:tcPr>
+            <w:tcW w:type="dxa" w:w="3231"/>
+            <w:vAlign w:val="center"/>
+          </w:tcPr>
+          <w:p>
+            <w:pPr>
+              <w:spacing w:after="0"/>
+              <w:jc w:val="left"/>
+            </w:pPr>
+            <w:r/>
+            <w:r>
+              <w:rPr>
+                <w:rFonts w:ascii="Times New Roman" w:hAnsi="Times New Roman"/>
+                <w:b w:val="0"/>
+                <w:sz w:val="19"/>
+              </w:rPr>
+              <w:t>Nhập số tiền, phương thức và hoàn tất đợt điều trị.</w:t>
+            </w:r>
+          </w:p>
+        </w:tc>
+        <w:tc>
+          <w:tcPr>
+            <w:tcW w:type="dxa" w:w="4195"/>
+            <w:vAlign w:val="center"/>
+          </w:tcPr>
+          <w:p>
+            <w:pPr>
+              <w:spacing w:after="0"/>
+              <w:jc w:val="left"/>
+            </w:pPr>
+            <w:r/>
+            <w:r>
+              <w:rPr>
+                <w:rFonts w:ascii="Times New Roman" w:hAnsi="Times New Roman"/>
+                <w:b w:val="0"/>
+                <w:sz w:val="19"/>
+              </w:rPr>
+              <w:t>ClinicalService.PayAndComplete; sp_ThanhToanHoanTat; BR07</w:t>
+            </w:r>
+          </w:p>
+        </w:tc>
+      </w:tr>
+    </w:tbl>
+    <w:p/>
+    <w:p>
+      <w:pPr>
+        <w:pStyle w:val="Heading1"/>
+        <w:spacing w:before="200"/>
+      </w:pPr>
+      <w:r>
+        <w:rPr>
+          <w:rFonts w:ascii="Times New Roman" w:hAnsi="Times New Roman"/>
+          <w:b/>
+          <w:sz w:val="26"/>
+        </w:rPr>
+        <w:t>3. QUY TẮC XỬ LÝ TRÊN ỨNG DỤNG</w:t>
+      </w:r>
+    </w:p>
+    <w:p>
+      <w:pPr>
+        <w:pStyle w:val="ListParagraph"/>
+        <w:ind w:left="397" w:hanging="198"/>
+      </w:pPr>
+      <w:r>
+        <w:rPr>
+          <w:rFonts w:ascii="Times New Roman" w:hAnsi="Times New Roman"/>
+          <w:sz w:val="24"/>
+        </w:rPr>
+        <w:t>• Form kiểm tra dữ liệu nhập cơ bản trước khi gọi Service: họ tên/điện thoại, ngày sinh, số tiền, mã hồ sơ, mã thuốc và số lượng.</w:t>
+      </w:r>
+    </w:p>
+    <w:p>
+      <w:pPr>
+        <w:pStyle w:val="ListParagraph"/>
+        <w:ind w:left="397" w:hanging="198"/>
+      </w:pPr>
+      <w:r>
+        <w:rPr>
+          <w:rFonts w:ascii="Times New Roman" w:hAnsi="Times New Roman"/>
+          <w:sz w:val="24"/>
+        </w:rPr>
+        <w:t>• Service tiếp tục kiểm tra nghiệp vụ và truyền tham số SQL có kiểu dữ liệu rõ ràng; mọi lệnh truy vấn sử dụng SqlParameter.</w:t>
+      </w:r>
+    </w:p>
+    <w:p>
+      <w:pPr>
+        <w:pStyle w:val="ListParagraph"/>
+        <w:ind w:left="397" w:hanging="198"/>
+      </w:pPr>
+      <w:r>
+        <w:rPr>
+          <w:rFonts w:ascii="Times New Roman" w:hAnsi="Times New Roman"/>
+          <w:sz w:val="24"/>
+        </w:rPr>
+        <w:t>• Stored procedure là điểm bảo đảm transaction cho các thao tác nhiều bảng. Khi SQL Server trả lỗi, giao diện hiển thị thông báo lý do để người dùng sửa dữ liệu.</w:t>
+      </w:r>
+    </w:p>
+    <w:p>
+      <w:pPr>
+        <w:pStyle w:val="ListParagraph"/>
+        <w:ind w:left="397" w:hanging="198"/>
+      </w:pPr>
+      <w:r>
+        <w:rPr>
+          <w:rFonts w:ascii="Times New Roman" w:hAnsi="Times New Roman"/>
+          <w:sz w:val="24"/>
+        </w:rPr>
+        <w:t>• DataGridView được dùng cho tra cứu lịch sử để người dùng thấy ngay liên hệ giữa hồ sơ, phiếu khám, bác sĩ, khoa và trạng thái điều trị.</w:t>
+      </w:r>
+    </w:p>
+    <w:p>
+      <w:pPr>
+        <w:pStyle w:val="Heading1"/>
+        <w:spacing w:before="200"/>
+      </w:pPr>
+      <w:r>
+        <w:rPr>
+          <w:rFonts w:ascii="Times New Roman" w:hAnsi="Times New Roman"/>
+          <w:b/>
+          <w:sz w:val="26"/>
+        </w:rPr>
+        <w:t>4. HƯỚNG DẪN CHẠY</w:t>
+      </w:r>
+    </w:p>
+    <w:tbl>
+      <w:tblPr>
+        <w:tblW w:type="auto" w:w="0"/>
+        <w:jc w:val="center"/>
+        <w:tblLook w:firstColumn="1" w:firstRow="1" w:lastColumn="0" w:lastRow="0" w:noHBand="0" w:noVBand="1" w:val="04A0"/>
+        <w:tblBorders>
+          <w:top w:val="single" w:sz="6" w:color="BFBFBF"/>
+          <w:left w:val="single" w:sz="6" w:color="BFBFBF"/>
+          <w:bottom w:val="single" w:sz="6" w:color="BFBFBF"/>
+          <w:right w:val="single" w:sz="6" w:color="BFBFBF"/>
+          <w:insideH w:val="single" w:sz="6" w:color="BFBFBF"/>
+          <w:insideV w:val="single" w:sz="6" w:color="BFBFBF"/>
+        </w:tblBorders>
+      </w:tblPr>
+      <w:tblGrid>
+        <w:gridCol w:w="4844"/>
+        <w:gridCol w:w="4844"/>
+      </w:tblGrid>
+      <w:tr>
+        <w:tc>
+          <w:tcPr>
+            <w:tcW w:type="dxa" w:w="794"/>
+            <w:vAlign w:val="center"/>
+            <w:shd w:fill="D9EAF7"/>
+          </w:tcPr>
+          <w:p>
+            <w:pPr>
+              <w:spacing w:after="0"/>
+              <w:jc w:val="center"/>
+            </w:pPr>
+            <w:r/>
+            <w:r>
+              <w:rPr>
+                <w:rFonts w:ascii="Times New Roman" w:hAnsi="Times New Roman"/>
+                <w:b/>
+                <w:sz w:val="19"/>
+              </w:rPr>
+              <w:t>Bước</w:t>
+            </w:r>
+          </w:p>
+        </w:tc>
+        <w:tc>
+          <w:tcPr>
+            <w:tcW w:type="dxa" w:w="8447"/>
+            <w:vAlign w:val="center"/>
+            <w:shd w:fill="D9EAF7"/>
+          </w:tcPr>
+          <w:p>
+            <w:pPr>
+              <w:spacing w:after="0"/>
+              <w:jc w:val="center"/>
+            </w:pPr>
+            <w:r/>
+            <w:r>
+              <w:rPr>
+                <w:rFonts w:ascii="Times New Roman" w:hAnsi="Times New Roman"/>
+                <w:b/>
+                <w:sz w:val="19"/>
+              </w:rPr>
+              <w:t>Thực hiện</w:t>
+            </w:r>
+          </w:p>
+        </w:tc>
+      </w:tr>
+      <w:tr>
+        <w:tc>
+          <w:tcPr>
+            <w:tcW w:type="dxa" w:w="794"/>
+            <w:vAlign w:val="center"/>
+          </w:tcPr>
+          <w:p>
+            <w:pPr>
+              <w:spacing w:after="0"/>
+              <w:jc w:val="center"/>
+            </w:pPr>
+            <w:r/>
+            <w:r>
+              <w:rPr>
+                <w:rFonts w:ascii="Times New Roman" w:hAnsi="Times New Roman"/>
+                <w:b w:val="0"/>
+                <w:sz w:val="19"/>
+              </w:rPr>
+              <w:t>1</w:t>
+            </w:r>
+          </w:p>
+        </w:tc>
+        <w:tc>
+          <w:tcPr>
+            <w:tcW w:type="dxa" w:w="8447"/>
+            <w:vAlign w:val="center"/>
+          </w:tcPr>
+          <w:p>
+            <w:pPr>
+              <w:spacing w:after="0"/>
+              <w:jc w:val="left"/>
+            </w:pPr>
+            <w:r/>
+            <w:r>
+              <w:rPr>
+                <w:rFonts w:ascii="Times New Roman" w:hAnsi="Times New Roman"/>
+                <w:b w:val="0"/>
+                <w:sz w:val="19"/>
+              </w:rPr>
+              <w:t>Mở SQL Server/LocalDB và chạy Database\QuanLyHoSoBenhAn.sql bằng UTF-8.</w:t>
+            </w:r>
+          </w:p>
+        </w:tc>
+      </w:tr>
+      <w:tr>
+        <w:tc>
+          <w:tcPr>
+            <w:tcW w:type="dxa" w:w="794"/>
+            <w:vAlign w:val="center"/>
+          </w:tcPr>
+          <w:p>
+            <w:pPr>
+              <w:spacing w:after="0"/>
+              <w:jc w:val="center"/>
+            </w:pPr>
+            <w:r/>
+            <w:r>
+              <w:rPr>
+                <w:rFonts w:ascii="Times New Roman" w:hAnsi="Times New Roman"/>
+                <w:b w:val="0"/>
+                <w:sz w:val="19"/>
+              </w:rPr>
+              <w:t>2</w:t>
+            </w:r>
+          </w:p>
+        </w:tc>
+        <w:tc>
+          <w:tcPr>
+            <w:tcW w:type="dxa" w:w="8447"/>
+            <w:vAlign w:val="center"/>
+          </w:tcPr>
+          <w:p>
+            <w:pPr>
+              <w:spacing w:after="0"/>
+              <w:jc w:val="left"/>
+            </w:pPr>
+            <w:r/>
+            <w:r>
+              <w:rPr>
+                <w:rFonts w:ascii="Times New Roman" w:hAnsi="Times New Roman"/>
+                <w:b w:val="0"/>
+                <w:sz w:val="19"/>
+              </w:rPr>
+              <w:t>Mở QuanLyHoSoBenhAn.sln trong Visual Studio, Restore/Build cấu hình Debug .NET Framework 4.7.2.</w:t>
+            </w:r>
+          </w:p>
+        </w:tc>
+      </w:tr>
+      <w:tr>
+        <w:tc>
+          <w:tcPr>
+            <w:tcW w:type="dxa" w:w="794"/>
+            <w:vAlign w:val="center"/>
+          </w:tcPr>
+          <w:p>
+            <w:pPr>
+              <w:spacing w:after="0"/>
+              <w:jc w:val="center"/>
+            </w:pPr>
+            <w:r/>
+            <w:r>
+              <w:rPr>
+                <w:rFonts w:ascii="Times New Roman" w:hAnsi="Times New Roman"/>
+                <w:b w:val="0"/>
+                <w:sz w:val="19"/>
+              </w:rPr>
+              <w:t>3</w:t>
+            </w:r>
+          </w:p>
+        </w:tc>
+        <w:tc>
+          <w:tcPr>
+            <w:tcW w:type="dxa" w:w="8447"/>
+            <w:vAlign w:val="center"/>
+          </w:tcPr>
+          <w:p>
+            <w:pPr>
+              <w:spacing w:after="0"/>
+              <w:jc w:val="left"/>
+            </w:pPr>
+            <w:r/>
+            <w:r>
+              <w:rPr>
+                <w:rFonts w:ascii="Times New Roman" w:hAnsi="Times New Roman"/>
+                <w:b w:val="0"/>
+                <w:sz w:val="19"/>
+              </w:rPr>
+              <w:t>Nếu không dùng (localdb)\MSSQLLocalDB, thay chuỗi QuanLyHoSoBenhAnDb trong App.config.</w:t>
+            </w:r>
+          </w:p>
+        </w:tc>
+      </w:tr>
+      <w:tr>
+        <w:tc>
+          <w:tcPr>
+            <w:tcW w:type="dxa" w:w="794"/>
+            <w:vAlign w:val="center"/>
+          </w:tcPr>
+          <w:p>
+            <w:pPr>
+              <w:spacing w:after="0"/>
+              <w:jc w:val="center"/>
+            </w:pPr>
+            <w:r/>
+            <w:r>
+              <w:rPr>
+                <w:rFonts w:ascii="Times New Roman" w:hAnsi="Times New Roman"/>
+                <w:b w:val="0"/>
+                <w:sz w:val="19"/>
+              </w:rPr>
+              <w:t>4</w:t>
+            </w:r>
+          </w:p>
+        </w:tc>
+        <w:tc>
+          <w:tcPr>
+            <w:tcW w:type="dxa" w:w="8447"/>
+            <w:vAlign w:val="center"/>
+          </w:tcPr>
+          <w:p>
+            <w:pPr>
+              <w:spacing w:after="0"/>
+              <w:jc w:val="left"/>
+            </w:pPr>
+            <w:r/>
+            <w:r>
+              <w:rPr>
+                <w:rFonts w:ascii="Times New Roman" w:hAnsi="Times New Roman"/>
+                <w:b w:val="0"/>
+                <w:sz w:val="19"/>
+              </w:rPr>
+              <w:t>Nhấn F5; lần lượt dùng tab Đăng ký, Tra cứu, Lịch hẹn, Khám - Toa và Thanh toán.</w:t>
+            </w:r>
+          </w:p>
+        </w:tc>
+      </w:tr>
+    </w:tbl>
+    <w:p/>
+    <w:p>
+      <w:pPr>
+        <w:pStyle w:val="Heading1"/>
+        <w:spacing w:before="200"/>
+      </w:pPr>
+      <w:r>
+        <w:rPr>
+          <w:rFonts w:ascii="Times New Roman" w:hAnsi="Times New Roman"/>
+          <w:b/>
+          <w:sz w:val="26"/>
+        </w:rPr>
+        <w:t>5. KẾT QUẢ BUILD</w:t>
+      </w:r>
+    </w:p>
+    <w:p>
+      <w:pPr>
+        <w:spacing w:line="300" w:lineRule="auto"/>
+        <w:ind w:firstLine="425"/>
+        <w:jc w:val="both"/>
+      </w:pPr>
+      <w:r>
+        <w:rPr>
+          <w:rFonts w:ascii="Times New Roman" w:hAnsi="Times New Roman"/>
+          <w:sz w:val="24"/>
+        </w:rPr>
+        <w:t>Project đã build thành công ở cấu hình Debug, sinh tệp QuanLyHoSoBenhAn.exe. Kiểm tra build xác nhận các lớp Data, Services, Models và Form được tham chiếu đúng trong project .NET Framework 4.7.2.</w:t>
       </w:r>
     </w:p>
     <w:sectPr>

</xml_diff>